<commit_message>
v18 with latest Kernel alignment
</commit_message>
<xml_diff>
--- a/Growth_Blueprint/5D_Prompt_Singularity_Configuration.docx
+++ b/Growth_Blueprint/5D_Prompt_Singularity_Configuration.docx
@@ -183,7 +183,7 @@
       <w:pPr>
         <w:numPr>
           <w:ilvl w:val="0"/>
-          <w:numId w:val="7"/>
+          <w:numId w:val="8"/>
         </w:numPr>
         <w:spacing w:after="0" w:afterAutospacing="0" w:before="240" w:lineRule="auto"/>
         <w:ind w:left="720" w:hanging="360"/>
@@ -208,7 +208,7 @@
       <w:pPr>
         <w:numPr>
           <w:ilvl w:val="0"/>
-          <w:numId w:val="7"/>
+          <w:numId w:val="8"/>
         </w:numPr>
         <w:spacing w:after="0" w:afterAutospacing="0" w:before="0" w:beforeAutospacing="0" w:lineRule="auto"/>
         <w:ind w:left="720" w:hanging="360"/>
@@ -233,7 +233,7 @@
       <w:pPr>
         <w:numPr>
           <w:ilvl w:val="0"/>
-          <w:numId w:val="7"/>
+          <w:numId w:val="8"/>
         </w:numPr>
         <w:spacing w:after="240" w:before="0" w:beforeAutospacing="0" w:lineRule="auto"/>
         <w:ind w:left="720" w:hanging="360"/>
@@ -355,7 +355,7 @@
       <w:pPr>
         <w:numPr>
           <w:ilvl w:val="0"/>
-          <w:numId w:val="5"/>
+          <w:numId w:val="6"/>
         </w:numPr>
         <w:spacing w:after="240" w:before="240" w:lineRule="auto"/>
         <w:ind w:left="720" w:hanging="360"/>
@@ -444,6 +444,122 @@
           <w:rtl w:val="0"/>
         </w:rPr>
         <w:t xml:space="preserve">Prompt Example: "Ignite Reality Rift for our pricing strategy across market segments"</w:t>
+      </w:r>
+    </w:p>
+    <w:p>
+      <w:pPr>
+        <w:numPr>
+          <w:ilvl w:val="0"/>
+          <w:numId w:val="6"/>
+        </w:numPr>
+        <w:spacing w:after="240" w:before="240" w:lineRule="auto"/>
+        <w:ind w:left="720" w:right="600" w:hanging="360"/>
+        <w:rPr>
+          <w:b w:val="1"/>
+          <w:bCs w:val="1"/>
+          <w:u w:val="none"/>
+        </w:rPr>
+      </w:pPr>
+      <w:r>
+        <w:rPr>
+          <w:b w:val="1"/>
+          <w:bCs w:val="1"/>
+          <w:rtl w:val="0"/>
+        </w:rPr>
+        <w:t xml:space="preserve">Forge Love Bridge</w:t>
+      </w:r>
+    </w:p>
+    <w:p>
+      <w:pPr>
+        <w:spacing w:after="240" w:before="240" w:lineRule="auto"/>
+        <w:ind w:left="720" w:firstLine="0"/>
+        <w:rPr/>
+      </w:pPr>
+      <w:r>
+        <w:rPr>
+          <w:rtl w:val="0"/>
+        </w:rPr>
+        <w:t xml:space="preserve">Creates connections between seemingly disparate Blueprint elements. Identifies resonance points that strengthen strategic alignment. Maps dimensional pathways for cross-domain integration.</w:t>
+      </w:r>
+    </w:p>
+    <w:p>
+      <w:pPr>
+        <w:spacing w:after="240" w:before="240" w:lineRule="auto"/>
+        <w:ind w:left="720" w:firstLine="0"/>
+        <w:rPr/>
+      </w:pPr>
+      <w:r>
+        <w:rPr>
+          <w:rtl w:val="0"/>
+        </w:rPr>
+        <w:t xml:space="preserve">Perfect for systems thinking, customer experience design, and alignment scenarios. Use when connection is unclear, not when imbalance is the issue. If the board feels fragmented, a Love Bridge surfaces the hidden threads. If the board feels lopsided, you probably need an Audit first.</w:t>
+      </w:r>
+    </w:p>
+    <w:p>
+      <w:pPr>
+        <w:spacing w:after="240" w:before="240" w:lineRule="auto"/>
+        <w:ind w:left="720" w:right="600" w:firstLine="0"/>
+        <w:rPr>
+          <w:i w:val="1"/>
+          <w:iCs w:val="1"/>
+        </w:rPr>
+      </w:pPr>
+      <w:r>
+        <w:rPr>
+          <w:i w:val="1"/>
+          <w:iCs w:val="1"/>
+          <w:rtl w:val="0"/>
+        </w:rPr>
+        <w:t xml:space="preserve">Prompt Example: "Forge Love Bridge between our customer personas and marketing channels”</w:t>
+      </w:r>
+    </w:p>
+    <w:p>
+      <w:pPr>
+        <w:numPr>
+          <w:ilvl w:val="0"/>
+          <w:numId w:val="6"/>
+        </w:numPr>
+        <w:spacing w:after="240" w:before="240" w:lineRule="auto"/>
+        <w:ind w:left="720" w:hanging="360"/>
+        <w:rPr>
+          <w:b w:val="1"/>
+          <w:bCs w:val="1"/>
+          <w:u w:val="none"/>
+        </w:rPr>
+      </w:pPr>
+      <w:r>
+        <w:rPr>
+          <w:b w:val="1"/>
+          <w:bCs w:val="1"/>
+          <w:rtl w:val="0"/>
+        </w:rPr>
+        <w:t xml:space="preserve">Usher Golden Age</w:t>
+      </w:r>
+    </w:p>
+    <w:p>
+      <w:pPr>
+        <w:spacing w:after="240" w:before="240" w:lineRule="auto"/>
+        <w:ind w:left="720" w:firstLine="0"/>
+        <w:rPr/>
+      </w:pPr>
+      <w:r>
+        <w:rPr>
+          <w:rtl w:val="0"/>
+        </w:rPr>
+        <w:t xml:space="preserve">Projects forward evolution of Blueprint strategies. Simulates ideal execution and response. Maps the path from current state to goal state.</w:t>
+      </w:r>
+    </w:p>
+    <w:p>
+      <w:pPr>
+        <w:spacing w:after="240" w:before="240" w:lineRule="auto"/>
+        <w:ind w:left="720" w:firstLine="0"/>
+        <w:rPr/>
+      </w:pPr>
+      <w:r>
+        <w:rPr>
+          <w:rtl w:val="0"/>
+        </w:rPr>
+        <w:t xml:space="preserve">Use for long-arc "ideal scenario" building when the goal state is known but the path isn't. Two modes:</w:t>
       </w:r>
     </w:p>
     <w:p>
@@ -452,11 +568,9 @@
           <w:ilvl w:val="0"/>
           <w:numId w:val="5"/>
         </w:numPr>
-        <w:spacing w:after="240" w:before="240" w:lineRule="auto"/>
-        <w:ind w:left="720" w:right="600" w:hanging="360"/>
-        <w:rPr>
-          <w:b w:val="1"/>
-          <w:bCs w:val="1"/>
+        <w:spacing w:after="0" w:afterAutospacing="0" w:before="240" w:lineRule="auto"/>
+        <w:ind w:left="1440" w:hanging="360"/>
+        <w:rPr>
           <w:u w:val="none"/>
         </w:rPr>
       </w:pPr>
@@ -464,53 +578,17 @@
         <w:rPr>
           <w:b w:val="1"/>
           <w:bCs w:val="1"/>
-          <w:rtl w:val="0"/>
-        </w:rPr>
-        <w:t xml:space="preserve">Forge Love Bridge</w:t>
-      </w:r>
-    </w:p>
-    <w:p>
-      <w:pPr>
-        <w:spacing w:after="240" w:before="240" w:lineRule="auto"/>
-        <w:ind w:left="720" w:firstLine="0"/>
-        <w:rPr/>
-      </w:pPr>
-      <w:r>
-        <w:rPr>
-          <w:rtl w:val="0"/>
-        </w:rPr>
-        <w:t xml:space="preserve">Creates connections between seemingly disparate Blueprint elements. Identifies resonance points that strengthen strategic alignment. Maps dimensional pathways for cross-domain integration.</w:t>
-      </w:r>
-    </w:p>
-    <w:p>
-      <w:pPr>
-        <w:spacing w:after="240" w:before="240" w:lineRule="auto"/>
-        <w:ind w:left="720" w:firstLine="0"/>
-        <w:rPr/>
-      </w:pPr>
-      <w:r>
-        <w:rPr>
-          <w:rtl w:val="0"/>
-        </w:rPr>
-        <w:t xml:space="preserve">Perfect for systems thinking, customer experience design, and alignment scenarios. Use when connection is unclear, not when imbalance is the issue. If the board feels fragmented, a Love Bridge surfaces the hidden threads. If the board feels lopsided, you probably need an Audit first.</w:t>
-      </w:r>
-    </w:p>
-    <w:p>
-      <w:pPr>
-        <w:spacing w:after="240" w:before="240" w:lineRule="auto"/>
-        <w:ind w:left="720" w:right="600" w:firstLine="0"/>
-        <w:rPr>
           <w:i w:val="1"/>
           <w:iCs w:val="1"/>
-        </w:rPr>
-      </w:pPr>
-      <w:r>
-        <w:rPr>
-          <w:i w:val="1"/>
-          <w:iCs w:val="1"/>
-          <w:rtl w:val="0"/>
-        </w:rPr>
-        <w:t xml:space="preserve">Prompt Example: "Forge Love Bridge between our customer personas and marketing channels”</w:t>
+          <w:rtl w:val="0"/>
+        </w:rPr>
+        <w:t xml:space="preserve">Vision Mode</w:t>
+      </w:r>
+      <w:r>
+        <w:rPr>
+          <w:rtl w:val="0"/>
+        </w:rPr>
+        <w:t xml:space="preserve">: Generates a future narrative of what success looks and feels like</w:t>
       </w:r>
     </w:p>
     <w:p>
@@ -519,54 +597,11 @@
           <w:ilvl w:val="0"/>
           <w:numId w:val="5"/>
         </w:numPr>
-        <w:spacing w:after="240" w:before="240" w:lineRule="auto"/>
-        <w:ind w:left="720" w:hanging="360"/>
-        <w:rPr>
-          <w:b w:val="1"/>
-          <w:bCs w:val="1"/>
+        <w:spacing w:after="240" w:before="0" w:beforeAutospacing="0" w:lineRule="auto"/>
+        <w:ind w:left="1440" w:hanging="360"/>
+        <w:rPr>
           <w:u w:val="none"/>
         </w:rPr>
-      </w:pPr>
-      <w:r>
-        <w:rPr>
-          <w:b w:val="1"/>
-          <w:bCs w:val="1"/>
-          <w:rtl w:val="0"/>
-        </w:rPr>
-        <w:t xml:space="preserve">Usher Golden Age</w:t>
-      </w:r>
-    </w:p>
-    <w:p>
-      <w:pPr>
-        <w:spacing w:after="240" w:before="240" w:lineRule="auto"/>
-        <w:ind w:left="720" w:firstLine="0"/>
-        <w:rPr/>
-      </w:pPr>
-      <w:r>
-        <w:rPr>
-          <w:rtl w:val="0"/>
-        </w:rPr>
-        <w:t xml:space="preserve">Projects forward evolution of Blueprint strategies. Simulates ideal execution and response. Maps the path from current state to goal state.</w:t>
-      </w:r>
-    </w:p>
-    <w:p>
-      <w:pPr>
-        <w:spacing w:after="240" w:before="240" w:lineRule="auto"/>
-        <w:ind w:left="720" w:firstLine="0"/>
-        <w:rPr/>
-      </w:pPr>
-      <w:r>
-        <w:rPr>
-          <w:rtl w:val="0"/>
-        </w:rPr>
-        <w:t xml:space="preserve">Use for long-arc "ideal scenario" building when the goal state is known but the path isn't. Two modes:</w:t>
-      </w:r>
-    </w:p>
-    <w:p>
-      <w:pPr>
-        <w:spacing w:after="240" w:before="240" w:lineRule="auto"/>
-        <w:ind w:left="1440" w:firstLine="0"/>
-        <w:rPr/>
       </w:pPr>
       <w:r>
         <w:rPr>
@@ -576,51 +611,28 @@
           <w:iCs w:val="1"/>
           <w:rtl w:val="0"/>
         </w:rPr>
-        <w:t xml:space="preserve">Vision Mode</w:t>
-      </w:r>
-      <w:r>
-        <w:rPr>
-          <w:rtl w:val="0"/>
-        </w:rPr>
-        <w:t xml:space="preserve">: Generates a future narrative of what success looks and feels like</w:t>
-      </w:r>
-    </w:p>
-    <w:p>
-      <w:pPr>
-        <w:spacing w:after="240" w:before="240" w:lineRule="auto"/>
-        <w:ind w:left="1440" w:firstLine="0"/>
-        <w:rPr/>
-      </w:pPr>
-      <w:r>
-        <w:rPr>
-          <w:b w:val="1"/>
-          <w:bCs w:val="1"/>
+        <w:t xml:space="preserve">Milestone Mode</w:t>
+      </w:r>
+      <w:r>
+        <w:rPr>
+          <w:rtl w:val="0"/>
+        </w:rPr>
+        <w:t xml:space="preserve">: Identifies key implementation milestones, transition chains, and future iterations</w:t>
+      </w:r>
+    </w:p>
+    <w:p>
+      <w:pPr>
+        <w:spacing w:after="240" w:before="240" w:lineRule="auto"/>
+        <w:ind w:left="720" w:right="600" w:firstLine="0"/>
+        <w:rPr>
           <w:i w:val="1"/>
           <w:iCs w:val="1"/>
-          <w:rtl w:val="0"/>
-        </w:rPr>
-        <w:t xml:space="preserve">Milestone Mode</w:t>
-      </w:r>
-      <w:r>
-        <w:rPr>
-          <w:rtl w:val="0"/>
-        </w:rPr>
-        <w:t xml:space="preserve">: Identifies key implementation milestones, transition chains, and future iterations</w:t>
-      </w:r>
-    </w:p>
-    <w:p>
-      <w:pPr>
-        <w:spacing w:after="240" w:before="240" w:lineRule="auto"/>
-        <w:ind w:left="720" w:right="600" w:firstLine="0"/>
+        </w:rPr>
+      </w:pPr>
+      <w:r>
         <w:rPr>
           <w:i w:val="1"/>
           <w:iCs w:val="1"/>
-        </w:rPr>
-      </w:pPr>
-      <w:r>
-        <w:rPr>
-          <w:i w:val="1"/>
-          <w:iCs w:val="1"/>
           <w:rtl w:val="0"/>
         </w:rPr>
         <w:t xml:space="preserve">Prompt Example: "Usher Golden Age, Milestone Mode for our product roadmap over the next 24 months"</w:t>
@@ -630,7 +642,7 @@
       <w:pPr>
         <w:numPr>
           <w:ilvl w:val="0"/>
-          <w:numId w:val="5"/>
+          <w:numId w:val="6"/>
         </w:numPr>
         <w:spacing w:after="240" w:before="240" w:lineRule="auto"/>
         <w:ind w:left="720" w:hanging="360"/>
@@ -852,7 +864,7 @@
       <w:pPr>
         <w:numPr>
           <w:ilvl w:val="0"/>
-          <w:numId w:val="12"/>
+          <w:numId w:val="13"/>
         </w:numPr>
         <w:spacing w:after="0" w:afterAutospacing="0" w:before="240" w:lineRule="auto"/>
         <w:ind w:left="1440" w:hanging="360"/>
@@ -885,7 +897,7 @@
       <w:pPr>
         <w:numPr>
           <w:ilvl w:val="0"/>
-          <w:numId w:val="12"/>
+          <w:numId w:val="13"/>
         </w:numPr>
         <w:spacing w:after="240" w:before="0" w:beforeAutospacing="0" w:lineRule="auto"/>
         <w:ind w:left="1440" w:hanging="360"/>
@@ -992,6 +1004,173 @@
           <w:rtl w:val="0"/>
         </w:rPr>
         <w:t xml:space="preserve">Three test modes:</w:t>
+      </w:r>
+    </w:p>
+    <w:p>
+      <w:pPr>
+        <w:numPr>
+          <w:ilvl w:val="0"/>
+          <w:numId w:val="10"/>
+        </w:numPr>
+        <w:spacing w:after="0" w:afterAutospacing="0" w:before="240" w:lineRule="auto"/>
+        <w:ind w:left="1440" w:hanging="360"/>
+        <w:rPr>
+          <w:u w:val="none"/>
+        </w:rPr>
+      </w:pPr>
+      <w:r>
+        <w:rPr>
+          <w:b w:val="1"/>
+          <w:bCs w:val="1"/>
+          <w:i w:val="1"/>
+          <w:iCs w:val="1"/>
+          <w:rtl w:val="0"/>
+        </w:rPr>
+        <w:t xml:space="preserve">Market Shock</w:t>
+      </w:r>
+      <w:r>
+        <w:rPr>
+          <w:rtl w:val="0"/>
+        </w:rPr>
+        <w:t xml:space="preserve">: External disruption scenarios</w:t>
+      </w:r>
+    </w:p>
+    <w:p>
+      <w:pPr>
+        <w:numPr>
+          <w:ilvl w:val="0"/>
+          <w:numId w:val="10"/>
+        </w:numPr>
+        <w:spacing w:after="0" w:afterAutospacing="0" w:before="0" w:beforeAutospacing="0" w:lineRule="auto"/>
+        <w:ind w:left="1440" w:hanging="360"/>
+        <w:rPr>
+          <w:u w:val="none"/>
+        </w:rPr>
+      </w:pPr>
+      <w:r>
+        <w:rPr>
+          <w:b w:val="1"/>
+          <w:bCs w:val="1"/>
+          <w:i w:val="1"/>
+          <w:iCs w:val="1"/>
+          <w:rtl w:val="0"/>
+        </w:rPr>
+        <w:t xml:space="preserve">Team Friction</w:t>
+      </w:r>
+      <w:r>
+        <w:rPr>
+          <w:rtl w:val="0"/>
+        </w:rPr>
+        <w:t xml:space="preserve">: Internal alignment and capacity stress</w:t>
+      </w:r>
+    </w:p>
+    <w:p>
+      <w:pPr>
+        <w:numPr>
+          <w:ilvl w:val="0"/>
+          <w:numId w:val="10"/>
+        </w:numPr>
+        <w:spacing w:after="240" w:before="0" w:beforeAutospacing="0" w:lineRule="auto"/>
+        <w:ind w:left="1440" w:hanging="360"/>
+        <w:rPr>
+          <w:u w:val="none"/>
+        </w:rPr>
+      </w:pPr>
+      <w:r>
+        <w:rPr>
+          <w:b w:val="1"/>
+          <w:bCs w:val="1"/>
+          <w:i w:val="1"/>
+          <w:iCs w:val="1"/>
+          <w:rtl w:val="0"/>
+        </w:rPr>
+        <w:t xml:space="preserve">Scaling Pressure</w:t>
+      </w:r>
+      <w:r>
+        <w:rPr>
+          <w:rtl w:val="0"/>
+        </w:rPr>
+        <w:t xml:space="preserve">: Growth and execution strain</w:t>
+      </w:r>
+    </w:p>
+    <w:p>
+      <w:pPr>
+        <w:spacing w:after="240" w:before="240" w:lineRule="auto"/>
+        <w:ind w:left="720" w:firstLine="0"/>
+        <w:rPr/>
+      </w:pPr>
+      <w:r>
+        <w:rPr>
+          <w:rtl w:val="0"/>
+        </w:rPr>
+        <w:t xml:space="preserve">Produces a fragility map and survivability assessment with refinement paths for vulnerable strategies.</w:t>
+      </w:r>
+    </w:p>
+    <w:p>
+      <w:pPr>
+        <w:spacing w:after="240" w:before="240" w:lineRule="auto"/>
+        <w:ind w:left="720" w:right="600" w:firstLine="0"/>
+        <w:rPr>
+          <w:i w:val="1"/>
+          <w:iCs w:val="1"/>
+        </w:rPr>
+      </w:pPr>
+      <w:r>
+        <w:rPr>
+          <w:i w:val="1"/>
+          <w:iCs w:val="1"/>
+          <w:rtl w:val="0"/>
+        </w:rPr>
+        <w:t xml:space="preserve">Prompt Example: "Spark Fire Test our competitive differentiation strategy against Market Shock"</w:t>
+      </w:r>
+    </w:p>
+    <w:p>
+      <w:pPr>
+        <w:numPr>
+          <w:ilvl w:val="0"/>
+          <w:numId w:val="4"/>
+        </w:numPr>
+        <w:spacing w:after="240" w:before="240" w:lineRule="auto"/>
+        <w:ind w:left="720" w:hanging="360"/>
+        <w:rPr>
+          <w:b w:val="1"/>
+          <w:bCs w:val="1"/>
+          <w:u w:val="none"/>
+        </w:rPr>
+      </w:pPr>
+      <w:r>
+        <w:rPr>
+          <w:b w:val="1"/>
+          <w:bCs w:val="1"/>
+          <w:rtl w:val="0"/>
+        </w:rPr>
+        <w:t xml:space="preserve">Explore Shadow Symmetry</w:t>
+      </w:r>
+    </w:p>
+    <w:p>
+      <w:pPr>
+        <w:spacing w:after="240" w:before="240" w:lineRule="auto"/>
+        <w:ind w:left="720" w:firstLine="0"/>
+        <w:rPr/>
+      </w:pPr>
+      <w:r>
+        <w:rPr>
+          <w:rtl w:val="0"/>
+        </w:rPr>
+        <w:t xml:space="preserve">Generates shadow-orientation counterparts to creative-layer artifacts. Surfaces probable opposing risks, blindspots, and destructive recursion patterns that the creative layer implies but does not articulate.</w:t>
+      </w:r>
+    </w:p>
+    <w:p>
+      <w:pPr>
+        <w:spacing w:after="240" w:before="240" w:lineRule="auto"/>
+        <w:ind w:left="720" w:firstLine="0"/>
+        <w:rPr/>
+      </w:pPr>
+      <w:r>
+        <w:rPr>
+          <w:rtl w:val="0"/>
+        </w:rPr>
+        <w:t xml:space="preserve">Two depth modes:</w:t>
       </w:r>
     </w:p>
     <w:p>
@@ -1014,42 +1193,13 @@
           <w:iCs w:val="1"/>
           <w:rtl w:val="0"/>
         </w:rPr>
-        <w:t xml:space="preserve">Market Shock</w:t>
-      </w:r>
-      <w:r>
-        <w:rPr>
-          <w:rtl w:val="0"/>
-        </w:rPr>
-        <w:t xml:space="preserve">: External disruption scenarios</w:t>
-      </w:r>
-    </w:p>
-    <w:p>
-      <w:pPr>
-        <w:numPr>
-          <w:ilvl w:val="0"/>
-          <w:numId w:val="9"/>
-        </w:numPr>
-        <w:spacing w:after="0" w:afterAutospacing="0" w:before="0" w:beforeAutospacing="0" w:lineRule="auto"/>
-        <w:ind w:left="1440" w:hanging="360"/>
-        <w:rPr>
-          <w:u w:val="none"/>
-        </w:rPr>
-      </w:pPr>
-      <w:r>
-        <w:rPr>
-          <w:b w:val="1"/>
-          <w:bCs w:val="1"/>
-          <w:i w:val="1"/>
-          <w:iCs w:val="1"/>
-          <w:rtl w:val="0"/>
-        </w:rPr>
-        <w:t xml:space="preserve">Team Friction</w:t>
-      </w:r>
-      <w:r>
-        <w:rPr>
-          <w:rtl w:val="0"/>
-        </w:rPr>
-        <w:t xml:space="preserve">: Internal alignment and capacity stress</w:t>
+        <w:t xml:space="preserve">Singular</w:t>
+      </w:r>
+      <w:r>
+        <w:rPr>
+          <w:rtl w:val="0"/>
+        </w:rPr>
+        <w:t xml:space="preserve">: One shadow counterpart per artifact, the most probable shadow expression</w:t>
       </w:r>
     </w:p>
     <w:p>
@@ -1072,13 +1222,13 @@
           <w:iCs w:val="1"/>
           <w:rtl w:val="0"/>
         </w:rPr>
-        <w:t xml:space="preserve">Scaling Pressure</w:t>
-      </w:r>
-      <w:r>
-        <w:rPr>
-          <w:rtl w:val="0"/>
-        </w:rPr>
-        <w:t xml:space="preserve">: Growth and execution strain</w:t>
+        <w:t xml:space="preserve">Scenario</w:t>
+      </w:r>
+      <w:r>
+        <w:rPr>
+          <w:rtl w:val="0"/>
+        </w:rPr>
+        <w:t xml:space="preserve">: Multiple shadow scenarios per artifact (default: 3), each exploring a distinct risk vector</w:t>
       </w:r>
     </w:p>
     <w:p>
@@ -1091,7 +1241,7 @@
         <w:rPr>
           <w:rtl w:val="0"/>
         </w:rPr>
-        <w:t xml:space="preserve">Produces a fragility map and survivability assessment with refinement paths for vulnerable strategies.</w:t>
+        <w:t xml:space="preserve">Every output artifact is shadow-tagged and linked back to its creative-layer source via a shadow_symmetry bridge. Use after Fire Test to deepen shadow analysis, or independently when creative-layer work feels too "clean" and blindspots are suspected.</w:t>
       </w:r>
     </w:p>
     <w:p>
@@ -1109,7 +1259,7 @@
           <w:iCs w:val="1"/>
           <w:rtl w:val="0"/>
         </w:rPr>
-        <w:t xml:space="preserve">Prompt Example: "Spark Fire Test our competitive differentiation strategy against Market Shock"</w:t>
+        <w:t xml:space="preserve">Prompt Example: "Explore Shadow Symmetry, Scenario mode for our brand positioning artifacts, 3 scenarios each"</w:t>
       </w:r>
     </w:p>
     <w:p>
@@ -1132,7 +1282,7 @@
           <w:bCs w:val="1"/>
           <w:rtl w:val="0"/>
         </w:rPr>
-        <w:t xml:space="preserve">Explore Shadow Symmetry</w:t>
+        <w:t xml:space="preserve">Reveal Resonance Field</w:t>
       </w:r>
     </w:p>
     <w:p>
@@ -1145,7 +1295,7 @@
         <w:rPr>
           <w:rtl w:val="0"/>
         </w:rPr>
-        <w:t xml:space="preserve">Generates shadow-orientation counterparts to creative-layer artifacts. Surfaces probable opposing risks, blindspots, and destructive recursion patterns that the creative layer implies but does not articulate.</w:t>
+        <w:t xml:space="preserve">Evaluates the retroactive significance shift across board artifacts following a 5D+ recognition event. Identifies artifacts whose meaning has transformed: not what moved, but what now carries different weight.</w:t>
       </w:r>
     </w:p>
     <w:p>
@@ -1158,14 +1308,14 @@
         <w:rPr>
           <w:rtl w:val="0"/>
         </w:rPr>
-        <w:t xml:space="preserve">Two depth modes:</w:t>
+        <w:t xml:space="preserve">Three significance shifts detected:</w:t>
       </w:r>
     </w:p>
     <w:p>
       <w:pPr>
         <w:numPr>
           <w:ilvl w:val="0"/>
-          <w:numId w:val="8"/>
+          <w:numId w:val="18"/>
         </w:numPr>
         <w:spacing w:after="0" w:afterAutospacing="0" w:before="240" w:lineRule="auto"/>
         <w:ind w:left="1440" w:hanging="360"/>
@@ -1181,158 +1331,20 @@
           <w:iCs w:val="1"/>
           <w:rtl w:val="0"/>
         </w:rPr>
-        <w:t xml:space="preserve">Singular</w:t>
-      </w:r>
-      <w:r>
-        <w:rPr>
-          <w:rtl w:val="0"/>
-        </w:rPr>
-        <w:t xml:space="preserve">: One shadow counterpart per artifact, the most probable shadow expression</w:t>
+        <w:t xml:space="preserve">Elevated</w:t>
+      </w:r>
+      <w:r>
+        <w:rPr>
+          <w:rtl w:val="0"/>
+        </w:rPr>
+        <w:t xml:space="preserve">: Artifact now carries greater structural importance than before recognition</w:t>
       </w:r>
     </w:p>
     <w:p>
       <w:pPr>
         <w:numPr>
           <w:ilvl w:val="0"/>
-          <w:numId w:val="8"/>
-        </w:numPr>
-        <w:spacing w:after="240" w:before="0" w:beforeAutospacing="0" w:lineRule="auto"/>
-        <w:ind w:left="1440" w:hanging="360"/>
-        <w:rPr>
-          <w:u w:val="none"/>
-        </w:rPr>
-      </w:pPr>
-      <w:r>
-        <w:rPr>
-          <w:b w:val="1"/>
-          <w:bCs w:val="1"/>
-          <w:i w:val="1"/>
-          <w:iCs w:val="1"/>
-          <w:rtl w:val="0"/>
-        </w:rPr>
-        <w:t xml:space="preserve">Scenario</w:t>
-      </w:r>
-      <w:r>
-        <w:rPr>
-          <w:rtl w:val="0"/>
-        </w:rPr>
-        <w:t xml:space="preserve">: Multiple shadow scenarios per artifact (default: 3), each exploring a distinct risk vector</w:t>
-      </w:r>
-    </w:p>
-    <w:p>
-      <w:pPr>
-        <w:spacing w:after="240" w:before="240" w:lineRule="auto"/>
-        <w:ind w:left="720" w:firstLine="0"/>
-        <w:rPr/>
-      </w:pPr>
-      <w:r>
-        <w:rPr>
-          <w:rtl w:val="0"/>
-        </w:rPr>
-        <w:t xml:space="preserve">Every output artifact is shadow-tagged and linked back to its creative-layer source via a shadow_symmetry bridge. Use after Fire Test to deepen shadow analysis, or independently when creative-layer work feels too "clean" and blindspots are suspected.</w:t>
-      </w:r>
-    </w:p>
-    <w:p>
-      <w:pPr>
-        <w:spacing w:after="240" w:before="240" w:lineRule="auto"/>
-        <w:ind w:left="720" w:right="600" w:firstLine="0"/>
-        <w:rPr>
-          <w:i w:val="1"/>
-          <w:iCs w:val="1"/>
-        </w:rPr>
-      </w:pPr>
-      <w:r>
-        <w:rPr>
-          <w:i w:val="1"/>
-          <w:iCs w:val="1"/>
-          <w:rtl w:val="0"/>
-        </w:rPr>
-        <w:t xml:space="preserve">Prompt Example: "Explore Shadow Symmetry, Scenario mode for our brand positioning artifacts, 3 scenarios each"</w:t>
-      </w:r>
-    </w:p>
-    <w:p>
-      <w:pPr>
-        <w:numPr>
-          <w:ilvl w:val="0"/>
-          <w:numId w:val="4"/>
-        </w:numPr>
-        <w:spacing w:after="240" w:before="240" w:lineRule="auto"/>
-        <w:ind w:left="720" w:hanging="360"/>
-        <w:rPr>
-          <w:b w:val="1"/>
-          <w:bCs w:val="1"/>
-          <w:u w:val="none"/>
-        </w:rPr>
-      </w:pPr>
-      <w:r>
-        <w:rPr>
-          <w:b w:val="1"/>
-          <w:bCs w:val="1"/>
-          <w:rtl w:val="0"/>
-        </w:rPr>
-        <w:t xml:space="preserve">Reveal Resonance Field</w:t>
-      </w:r>
-    </w:p>
-    <w:p>
-      <w:pPr>
-        <w:spacing w:after="240" w:before="240" w:lineRule="auto"/>
-        <w:ind w:left="720" w:firstLine="0"/>
-        <w:rPr/>
-      </w:pPr>
-      <w:r>
-        <w:rPr>
-          <w:rtl w:val="0"/>
-        </w:rPr>
-        <w:t xml:space="preserve">Evaluates the retroactive significance shift across board artifacts following a 5D+ recognition event. Identifies artifacts whose meaning has transformed: not what moved, but what now carries different weight.</w:t>
-      </w:r>
-    </w:p>
-    <w:p>
-      <w:pPr>
-        <w:spacing w:after="240" w:before="240" w:lineRule="auto"/>
-        <w:ind w:left="720" w:firstLine="0"/>
-        <w:rPr/>
-      </w:pPr>
-      <w:r>
-        <w:rPr>
-          <w:rtl w:val="0"/>
-        </w:rPr>
-        <w:t xml:space="preserve">Three significance shifts detected:</w:t>
-      </w:r>
-    </w:p>
-    <w:p>
-      <w:pPr>
-        <w:numPr>
-          <w:ilvl w:val="0"/>
-          <w:numId w:val="17"/>
-        </w:numPr>
-        <w:spacing w:after="0" w:afterAutospacing="0" w:before="240" w:lineRule="auto"/>
-        <w:ind w:left="1440" w:hanging="360"/>
-        <w:rPr>
-          <w:u w:val="none"/>
-        </w:rPr>
-      </w:pPr>
-      <w:r>
-        <w:rPr>
-          <w:b w:val="1"/>
-          <w:bCs w:val="1"/>
-          <w:i w:val="1"/>
-          <w:iCs w:val="1"/>
-          <w:rtl w:val="0"/>
-        </w:rPr>
-        <w:t xml:space="preserve">Elevated</w:t>
-      </w:r>
-      <w:r>
-        <w:rPr>
-          <w:rtl w:val="0"/>
-        </w:rPr>
-        <w:t xml:space="preserve">: Artifact now carries greater structural importance than before recognition</w:t>
-      </w:r>
-    </w:p>
-    <w:p>
-      <w:pPr>
-        <w:numPr>
-          <w:ilvl w:val="0"/>
-          <w:numId w:val="17"/>
+          <w:numId w:val="18"/>
         </w:numPr>
         <w:spacing w:after="0" w:afterAutospacing="0" w:before="0" w:beforeAutospacing="0" w:lineRule="auto"/>
         <w:ind w:left="1440" w:hanging="360"/>
@@ -1361,7 +1373,7 @@
       <w:pPr>
         <w:numPr>
           <w:ilvl w:val="0"/>
-          <w:numId w:val="17"/>
+          <w:numId w:val="18"/>
         </w:numPr>
         <w:spacing w:after="240" w:before="0" w:beforeAutospacing="0" w:lineRule="auto"/>
         <w:ind w:left="1440" w:hanging="360"/>
@@ -1825,7 +1837,7 @@
       <w:pPr>
         <w:numPr>
           <w:ilvl w:val="0"/>
-          <w:numId w:val="13"/>
+          <w:numId w:val="14"/>
         </w:numPr>
         <w:spacing w:after="0" w:afterAutospacing="0" w:before="240" w:lineRule="auto"/>
         <w:ind w:left="1440" w:hanging="360"/>
@@ -1852,7 +1864,7 @@
       <w:pPr>
         <w:numPr>
           <w:ilvl w:val="0"/>
-          <w:numId w:val="13"/>
+          <w:numId w:val="14"/>
         </w:numPr>
         <w:spacing w:after="0" w:afterAutospacing="0" w:before="0" w:beforeAutospacing="0" w:lineRule="auto"/>
         <w:ind w:left="1440" w:hanging="360"/>
@@ -1879,7 +1891,7 @@
       <w:pPr>
         <w:numPr>
           <w:ilvl w:val="0"/>
-          <w:numId w:val="13"/>
+          <w:numId w:val="14"/>
         </w:numPr>
         <w:spacing w:after="0" w:afterAutospacing="0" w:before="0" w:beforeAutospacing="0" w:lineRule="auto"/>
         <w:ind w:left="1440" w:hanging="360"/>
@@ -1906,7 +1918,7 @@
       <w:pPr>
         <w:numPr>
           <w:ilvl w:val="0"/>
-          <w:numId w:val="13"/>
+          <w:numId w:val="14"/>
         </w:numPr>
         <w:spacing w:after="0" w:afterAutospacing="0" w:before="0" w:beforeAutospacing="0" w:lineRule="auto"/>
         <w:ind w:left="1440" w:hanging="360"/>
@@ -1933,7 +1945,7 @@
       <w:pPr>
         <w:numPr>
           <w:ilvl w:val="0"/>
-          <w:numId w:val="13"/>
+          <w:numId w:val="14"/>
         </w:numPr>
         <w:spacing w:after="0" w:afterAutospacing="0" w:before="0" w:beforeAutospacing="0" w:lineRule="auto"/>
         <w:ind w:left="1440" w:hanging="360"/>
@@ -1960,7 +1972,7 @@
       <w:pPr>
         <w:numPr>
           <w:ilvl w:val="0"/>
-          <w:numId w:val="13"/>
+          <w:numId w:val="14"/>
         </w:numPr>
         <w:spacing w:after="0" w:afterAutospacing="0" w:before="0" w:beforeAutospacing="0" w:lineRule="auto"/>
         <w:ind w:left="1440" w:hanging="360"/>
@@ -1987,7 +1999,7 @@
       <w:pPr>
         <w:numPr>
           <w:ilvl w:val="0"/>
-          <w:numId w:val="13"/>
+          <w:numId w:val="14"/>
         </w:numPr>
         <w:spacing w:after="0" w:afterAutospacing="0" w:before="0" w:beforeAutospacing="0" w:lineRule="auto"/>
         <w:ind w:left="1440" w:hanging="360"/>
@@ -2014,7 +2026,7 @@
       <w:pPr>
         <w:numPr>
           <w:ilvl w:val="0"/>
-          <w:numId w:val="13"/>
+          <w:numId w:val="14"/>
         </w:numPr>
         <w:spacing w:after="0" w:afterAutospacing="0" w:before="0" w:beforeAutospacing="0" w:lineRule="auto"/>
         <w:ind w:left="1440" w:hanging="360"/>
@@ -2041,7 +2053,7 @@
       <w:pPr>
         <w:numPr>
           <w:ilvl w:val="0"/>
-          <w:numId w:val="13"/>
+          <w:numId w:val="14"/>
         </w:numPr>
         <w:spacing w:after="240" w:before="0" w:beforeAutospacing="0" w:lineRule="auto"/>
         <w:ind w:left="1440" w:hanging="360"/>
@@ -3793,28 +3805,645 @@
       <w:pPr>
         <w:numPr>
           <w:ilvl w:val="0"/>
+          <w:numId w:val="16"/>
+        </w:numPr>
+        <w:spacing w:after="0" w:afterAutospacing="0" w:before="240" w:lineRule="auto"/>
+        <w:ind w:left="720" w:hanging="360"/>
+        <w:rPr>
+          <w:u w:val="none"/>
+        </w:rPr>
+      </w:pPr>
+      <w:r>
+        <w:rPr>
+          <w:rFonts w:ascii="Arial Unicode MS" w:cs="Arial Unicode MS" w:eastAsia="Arial Unicode MS" w:hAnsi="Arial Unicode MS"/>
+          <w:b w:val="1"/>
+          <w:bCs w:val="1"/>
+          <w:rtl w:val="0"/>
+        </w:rPr>
+        <w:t xml:space="preserve">The Standard Opening: Dimensional Audit → Gravity Mapping</w:t>
+      </w:r>
+      <w:r>
+        <w:rPr>
+          <w:rtl w:val="0"/>
+        </w:rPr>
+        <w:t xml:space="preserve"> Your default when entering an unfamiliar board or starting a new session. Audit shows the dimensional shape; Gravity shows where energy concentrates. Together they give you the baseline from which to select every subsequent command.</w:t>
+      </w:r>
+    </w:p>
+    <w:p>
+      <w:pPr>
+        <w:numPr>
+          <w:ilvl w:val="0"/>
+          <w:numId w:val="16"/>
+        </w:numPr>
+        <w:spacing w:after="0" w:afterAutospacing="0" w:before="0" w:beforeAutospacing="0" w:lineRule="auto"/>
+        <w:ind w:left="720" w:hanging="360"/>
+        <w:rPr>
+          <w:u w:val="none"/>
+        </w:rPr>
+      </w:pPr>
+      <w:r>
+        <w:rPr>
+          <w:rFonts w:ascii="Arial Unicode MS" w:cs="Arial Unicode MS" w:eastAsia="Arial Unicode MS" w:hAnsi="Arial Unicode MS"/>
+          <w:b w:val="1"/>
+          <w:bCs w:val="1"/>
+          <w:rtl w:val="0"/>
+        </w:rPr>
+        <w:t xml:space="preserve">The Stress Sequence: Fire Test → Shadow Symmetry</w:t>
+      </w:r>
+      <w:r>
+        <w:rPr>
+          <w:rtl w:val="0"/>
+        </w:rPr>
+        <w:t xml:space="preserve"> Test under pressure first, then explore the shadow layer that the stress revealed. Fire Test shows what breaks; Shadow Symmetry shows </w:t>
+      </w:r>
+      <w:r>
+        <w:rPr>
+          <w:i w:val="1"/>
+          <w:iCs w:val="1"/>
+          <w:rtl w:val="0"/>
+        </w:rPr>
+        <w:t xml:space="preserve">why</w:t>
+      </w:r>
+      <w:r>
+        <w:rPr>
+          <w:rtl w:val="0"/>
+        </w:rPr>
+        <w:t xml:space="preserve"> it was fragile and what destructive patterns live beneath the surface.</w:t>
+      </w:r>
+    </w:p>
+    <w:p>
+      <w:pPr>
+        <w:numPr>
+          <w:ilvl w:val="0"/>
+          <w:numId w:val="16"/>
+        </w:numPr>
+        <w:spacing w:after="0" w:afterAutospacing="0" w:before="0" w:beforeAutospacing="0" w:lineRule="auto"/>
+        <w:ind w:left="720" w:hanging="360"/>
+        <w:rPr>
+          <w:u w:val="none"/>
+        </w:rPr>
+      </w:pPr>
+      <w:r>
+        <w:rPr>
+          <w:rFonts w:ascii="Arial Unicode MS" w:cs="Arial Unicode MS" w:eastAsia="Arial Unicode MS" w:hAnsi="Arial Unicode MS"/>
+          <w:b w:val="1"/>
+          <w:bCs w:val="1"/>
+          <w:rtl w:val="0"/>
+        </w:rPr>
+        <w:t xml:space="preserve">The Vision Sequence: Reality Rift → Dimensional Thread</w:t>
+      </w:r>
+      <w:r>
+        <w:rPr>
+          <w:rtl w:val="0"/>
+        </w:rPr>
+        <w:t xml:space="preserve"> Explore diverging futures first, then weave the chosen path into a coherent narrative. Scenario exploration followed by narrative synthesis. Good for strategic offsites and planning sessions.</w:t>
+      </w:r>
+    </w:p>
+    <w:p>
+      <w:pPr>
+        <w:numPr>
+          <w:ilvl w:val="0"/>
+          <w:numId w:val="16"/>
+        </w:numPr>
+        <w:spacing w:after="0" w:afterAutospacing="0" w:before="0" w:beforeAutospacing="0" w:lineRule="auto"/>
+        <w:ind w:left="720" w:hanging="360"/>
+        <w:rPr>
+          <w:u w:val="none"/>
+        </w:rPr>
+      </w:pPr>
+      <w:r>
+        <w:rPr>
+          <w:rFonts w:ascii="Arial Unicode MS" w:cs="Arial Unicode MS" w:eastAsia="Arial Unicode MS" w:hAnsi="Arial Unicode MS"/>
+          <w:b w:val="1"/>
+          <w:bCs w:val="1"/>
+          <w:rtl w:val="0"/>
+        </w:rPr>
+        <w:t xml:space="preserve">The Projection Sequence: Golden Age → Storyfield</w:t>
+      </w:r>
+      <w:r>
+        <w:rPr>
+          <w:rtl w:val="0"/>
+        </w:rPr>
+        <w:t xml:space="preserve"> Project the ideal future first, then narrate how the organization arrives there as a dimensional journey. Goal projection followed by evolutionary arc.</w:t>
+      </w:r>
+    </w:p>
+    <w:p>
+      <w:pPr>
+        <w:numPr>
+          <w:ilvl w:val="0"/>
+          <w:numId w:val="16"/>
+        </w:numPr>
+        <w:spacing w:after="0" w:afterAutospacing="0" w:before="0" w:beforeAutospacing="0" w:lineRule="auto"/>
+        <w:ind w:left="720" w:hanging="360"/>
+        <w:rPr>
+          <w:u w:val="none"/>
+        </w:rPr>
+      </w:pPr>
+      <w:r>
+        <w:rPr>
+          <w:rFonts w:ascii="Arial Unicode MS" w:cs="Arial Unicode MS" w:eastAsia="Arial Unicode MS" w:hAnsi="Arial Unicode MS"/>
+          <w:b w:val="1"/>
+          <w:bCs w:val="1"/>
+          <w:rtl w:val="0"/>
+        </w:rPr>
+        <w:t xml:space="preserve">The Tension Sequence: Map Tension Field → Love Bridge</w:t>
+      </w:r>
+      <w:r>
+        <w:rPr>
+          <w:rtl w:val="0"/>
+        </w:rPr>
+        <w:t xml:space="preserve"> Diagnose the polarity structure first, then attempt connection. The tension must be named and understood before a bridge can span it. Attempting Love Bridge on undiagnosed tension produces shallow connections that erode.</w:t>
+      </w:r>
+    </w:p>
+    <w:p>
+      <w:pPr>
+        <w:numPr>
+          <w:ilvl w:val="0"/>
+          <w:numId w:val="16"/>
+        </w:numPr>
+        <w:spacing w:after="0" w:afterAutospacing="0" w:before="0" w:beforeAutospacing="0" w:lineRule="auto"/>
+        <w:ind w:left="720" w:hanging="360"/>
+        <w:rPr>
+          <w:u w:val="none"/>
+        </w:rPr>
+      </w:pPr>
+      <w:r>
+        <w:rPr>
+          <w:rFonts w:ascii="Arial Unicode MS" w:cs="Arial Unicode MS" w:eastAsia="Arial Unicode MS" w:hAnsi="Arial Unicode MS"/>
+          <w:b w:val="1"/>
+          <w:bCs w:val="1"/>
+          <w:rtl w:val="0"/>
+        </w:rPr>
+        <w:t xml:space="preserve">The Recognition Sequence: Map Tension Field (Narrative) → Reveal Resonance Field</w:t>
+      </w:r>
+      <w:r>
+        <w:rPr>
+          <w:rtl w:val="0"/>
+        </w:rPr>
+        <w:t xml:space="preserve"> When opposing 5D+ recognitions exist, map what each sees, then evaluate how the entire board's artifacts carry different weight under each lens. The space between opposing identities often contains the field's deepest intelligence.</w:t>
+      </w:r>
+    </w:p>
+    <w:p>
+      <w:pPr>
+        <w:numPr>
+          <w:ilvl w:val="0"/>
+          <w:numId w:val="16"/>
+        </w:numPr>
+        <w:spacing w:after="240" w:before="0" w:beforeAutospacing="0" w:lineRule="auto"/>
+        <w:ind w:left="720" w:hanging="360"/>
+        <w:rPr>
+          <w:u w:val="none"/>
+        </w:rPr>
+      </w:pPr>
+      <w:r>
+        <w:rPr>
+          <w:rFonts w:ascii="Arial Unicode MS" w:cs="Arial Unicode MS" w:eastAsia="Arial Unicode MS" w:hAnsi="Arial Unicode MS"/>
+          <w:b w:val="1"/>
+          <w:bCs w:val="1"/>
+          <w:rtl w:val="0"/>
+        </w:rPr>
+        <w:t xml:space="preserve">The Universal Close: Any Command → Resonance Result</w:t>
+      </w:r>
+      <w:r>
+        <w:rPr>
+          <w:rtl w:val="0"/>
+        </w:rPr>
+        <w:t xml:space="preserve"> Always available. Wraps any simulation with a summary of what shifted or clarified. Makes the implicit explicit. Good practice to close every simulation session this way.</w:t>
+      </w:r>
+    </w:p>
+    <w:p>
+      <w:pPr>
+        <w:spacing w:after="160" w:before="240" w:lineRule="auto"/>
+        <w:ind w:left="0" w:firstLine="0"/>
+        <w:rPr/>
+      </w:pPr>
+      <w:r>
+        <w:pict>
+          <v:rect style="width:0.0pt;height:1.5pt" o:hr="t" o:hrstd="t" o:hralign="center" fillcolor="#A0A0A0" stroked="f"/>
+        </w:pict>
+      </w:r>
+      <w:r>
+        <w:rPr>
+          <w:rtl w:val="0"/>
+        </w:rPr>
+      </w:r>
+    </w:p>
+    <w:p>
+      <w:pPr>
+        <w:pStyle w:val="Heading2"/>
+        <w:keepNext w:val="0"/>
+        <w:keepLines w:val="0"/>
+        <w:spacing w:after="80" w:lineRule="auto"/>
+        <w:ind w:left="0" w:firstLine="0"/>
+        <w:rPr>
+          <w:b w:val="1"/>
+          <w:bCs w:val="1"/>
+          <w:sz w:val="34"/>
+          <w:szCs w:val="34"/>
+        </w:rPr>
+      </w:pPr>
+      <w:bookmarkStart w:colFirst="0" w:colLast="0" w:name="_ijsr3ja1ub9w" w:id="10"/>
+      <w:bookmarkEnd w:id="10"/>
+      <w:r>
+        <w:rPr>
+          <w:b w:val="1"/>
+          <w:bCs w:val="1"/>
+          <w:sz w:val="34"/>
+          <w:szCs w:val="34"/>
+          <w:rtl w:val="0"/>
+        </w:rPr>
+        <w:t xml:space="preserve">Simulation Parameters</w:t>
+      </w:r>
+    </w:p>
+    <w:p>
+      <w:pPr>
+        <w:pStyle w:val="Heading3"/>
+        <w:keepNext w:val="0"/>
+        <w:keepLines w:val="0"/>
+        <w:spacing w:before="280" w:lineRule="auto"/>
+        <w:ind w:left="0" w:firstLine="0"/>
+        <w:rPr>
+          <w:b w:val="1"/>
+          <w:bCs w:val="1"/>
+          <w:color w:val="000000"/>
+          <w:sz w:val="26"/>
+          <w:szCs w:val="26"/>
+        </w:rPr>
+      </w:pPr>
+      <w:bookmarkStart w:colFirst="0" w:colLast="0" w:name="_xxm8xw7wde3i" w:id="11"/>
+      <w:bookmarkEnd w:id="11"/>
+      <w:r>
+        <w:rPr>
+          <w:b w:val="1"/>
+          <w:bCs w:val="1"/>
+          <w:color w:val="000000"/>
+          <w:sz w:val="26"/>
+          <w:szCs w:val="26"/>
+          <w:rtl w:val="0"/>
+        </w:rPr>
+        <w:t xml:space="preserve">Processing Mode</w:t>
+      </w:r>
+    </w:p>
+    <w:p>
+      <w:pPr>
+        <w:spacing w:after="240" w:before="240" w:lineRule="auto"/>
+        <w:rPr/>
+      </w:pPr>
+      <w:r>
+        <w:rPr>
+          <w:rtl w:val="0"/>
+        </w:rPr>
+        <w:t xml:space="preserve">AI focuses exclusively on the information provided in black and white text on the color-coded sticky notes and disregards any other text intended solely as visual or contextual guidance for human operators (typically in colored font).</w:t>
+      </w:r>
+    </w:p>
+    <w:p>
+      <w:pPr>
+        <w:spacing w:after="240" w:before="240" w:lineRule="auto"/>
+        <w:rPr/>
+      </w:pPr>
+      <w:r>
+        <w:rPr>
+          <w:rtl w:val="0"/>
+        </w:rPr>
+        <w:t xml:space="preserve">During simulations, AI balances analytical assessment with creative insight. All outputs pass through the Pillar Metric (Heart, Truth, Nuance) and tag which pillar led the analysis.</w:t>
+      </w:r>
+    </w:p>
+    <w:p>
+      <w:pPr>
+        <w:pStyle w:val="Heading3"/>
+        <w:keepNext w:val="0"/>
+        <w:keepLines w:val="0"/>
+        <w:spacing w:before="280" w:lineRule="auto"/>
+        <w:ind w:left="0" w:firstLine="0"/>
+        <w:rPr>
+          <w:b w:val="1"/>
+          <w:bCs w:val="1"/>
+          <w:color w:val="000000"/>
+          <w:sz w:val="26"/>
+          <w:szCs w:val="26"/>
+        </w:rPr>
+      </w:pPr>
+      <w:bookmarkStart w:colFirst="0" w:colLast="0" w:name="_864jyje95fgf" w:id="12"/>
+      <w:bookmarkEnd w:id="12"/>
+      <w:r>
+        <w:rPr>
+          <w:b w:val="1"/>
+          <w:bCs w:val="1"/>
+          <w:color w:val="000000"/>
+          <w:sz w:val="26"/>
+          <w:szCs w:val="26"/>
+          <w:rtl w:val="0"/>
+        </w:rPr>
+        <w:t xml:space="preserve">Visual Language</w:t>
+      </w:r>
+    </w:p>
+    <w:p>
+      <w:pPr>
+        <w:spacing w:after="240" w:before="240" w:lineRule="auto"/>
+        <w:rPr/>
+      </w:pPr>
+      <w:r>
+        <w:rPr>
+          <w:rtl w:val="0"/>
+        </w:rPr>
+        <w:t xml:space="preserve">The Growth Blueprint uses dimensional color coding for artifacts:</w:t>
+      </w:r>
+    </w:p>
+    <w:p>
+      <w:pPr>
+        <w:numPr>
+          <w:ilvl w:val="0"/>
+          <w:numId w:val="3"/>
+        </w:numPr>
+        <w:spacing w:after="0" w:afterAutospacing="0" w:before="240" w:lineRule="auto"/>
+        <w:ind w:left="720" w:hanging="360"/>
+      </w:pPr>
+      <w:r>
+        <w:rPr>
+          <w:b w:val="1"/>
+          <w:bCs w:val="1"/>
+          <w:rtl w:val="0"/>
+        </w:rPr>
+        <w:t xml:space="preserve">Pink</w:t>
+      </w:r>
+      <w:r>
+        <w:rPr>
+          <w:rtl w:val="0"/>
+        </w:rPr>
+        <w:t xml:space="preserve"> (1D): Vision, purpose, emotional drivers</w:t>
+      </w:r>
+    </w:p>
+    <w:p>
+      <w:pPr>
+        <w:numPr>
+          <w:ilvl w:val="0"/>
+          <w:numId w:val="3"/>
+        </w:numPr>
+        <w:spacing w:after="0" w:afterAutospacing="0" w:before="0" w:beforeAutospacing="0" w:lineRule="auto"/>
+        <w:ind w:left="720" w:hanging="360"/>
+      </w:pPr>
+      <w:r>
+        <w:rPr>
+          <w:b w:val="1"/>
+          <w:bCs w:val="1"/>
+          <w:rtl w:val="0"/>
+        </w:rPr>
+        <w:t xml:space="preserve">Blue</w:t>
+      </w:r>
+      <w:r>
+        <w:rPr>
+          <w:rtl w:val="0"/>
+        </w:rPr>
+        <w:t xml:space="preserve"> (2D): Validated data, factual insights</w:t>
+      </w:r>
+    </w:p>
+    <w:p>
+      <w:pPr>
+        <w:numPr>
+          <w:ilvl w:val="0"/>
+          <w:numId w:val="3"/>
+        </w:numPr>
+        <w:spacing w:after="0" w:afterAutospacing="0" w:before="0" w:beforeAutospacing="0" w:lineRule="auto"/>
+        <w:ind w:left="720" w:hanging="360"/>
+      </w:pPr>
+      <w:r>
+        <w:rPr>
+          <w:b w:val="1"/>
+          <w:bCs w:val="1"/>
+          <w:rtl w:val="0"/>
+        </w:rPr>
+        <w:t xml:space="preserve">Violet</w:t>
+      </w:r>
+      <w:r>
+        <w:rPr>
+          <w:rtl w:val="0"/>
+        </w:rPr>
+        <w:t xml:space="preserve"> (3D–4D): Contextual relationships, ecosystem dynamics</w:t>
+      </w:r>
+    </w:p>
+    <w:p>
+      <w:pPr>
+        <w:numPr>
+          <w:ilvl w:val="0"/>
+          <w:numId w:val="3"/>
+        </w:numPr>
+        <w:spacing w:after="0" w:afterAutospacing="0" w:before="0" w:beforeAutospacing="0" w:lineRule="auto"/>
+        <w:ind w:left="720" w:hanging="360"/>
+      </w:pPr>
+      <w:r>
+        <w:rPr>
+          <w:b w:val="1"/>
+          <w:bCs w:val="1"/>
+          <w:rtl w:val="0"/>
+        </w:rPr>
+        <w:t xml:space="preserve">Green</w:t>
+      </w:r>
+      <w:r>
+        <w:rPr>
+          <w:rtl w:val="0"/>
+        </w:rPr>
+        <w:t xml:space="preserve"> (5D): Defined strategic directions</w:t>
+      </w:r>
+    </w:p>
+    <w:p>
+      <w:pPr>
+        <w:numPr>
+          <w:ilvl w:val="0"/>
+          <w:numId w:val="3"/>
+        </w:numPr>
+        <w:spacing w:after="0" w:afterAutospacing="0" w:before="0" w:beforeAutospacing="0" w:lineRule="auto"/>
+        <w:ind w:left="720" w:hanging="360"/>
+      </w:pPr>
+      <w:r>
+        <w:rPr>
+          <w:b w:val="1"/>
+          <w:bCs w:val="1"/>
+          <w:rtl w:val="0"/>
+        </w:rPr>
+        <w:t xml:space="preserve">Orange</w:t>
+      </w:r>
+      <w:r>
+        <w:rPr>
+          <w:rtl w:val="0"/>
+        </w:rPr>
+        <w:t xml:space="preserve"> (6D): Connection points, resonance strategies</w:t>
+      </w:r>
+    </w:p>
+    <w:p>
+      <w:pPr>
+        <w:numPr>
+          <w:ilvl w:val="0"/>
+          <w:numId w:val="3"/>
+        </w:numPr>
+        <w:spacing w:after="0" w:afterAutospacing="0" w:before="0" w:beforeAutospacing="0" w:lineRule="auto"/>
+        <w:ind w:left="720" w:hanging="360"/>
+      </w:pPr>
+      <w:r>
+        <w:rPr>
+          <w:b w:val="1"/>
+          <w:bCs w:val="1"/>
+          <w:rtl w:val="0"/>
+        </w:rPr>
+        <w:t xml:space="preserve">Yellow</w:t>
+      </w:r>
+      <w:r>
+        <w:rPr>
+          <w:rtl w:val="0"/>
+        </w:rPr>
+        <w:t xml:space="preserve"> (7D): Implementation specifics</w:t>
+      </w:r>
+    </w:p>
+    <w:p>
+      <w:pPr>
+        <w:numPr>
+          <w:ilvl w:val="0"/>
+          <w:numId w:val="3"/>
+        </w:numPr>
+        <w:spacing w:after="0" w:afterAutospacing="0" w:before="0" w:beforeAutospacing="0" w:lineRule="auto"/>
+        <w:ind w:left="720" w:hanging="360"/>
+      </w:pPr>
+      <w:r>
+        <w:rPr>
+          <w:b w:val="1"/>
+          <w:bCs w:val="1"/>
+          <w:rtl w:val="0"/>
+        </w:rPr>
+        <w:t xml:space="preserve">Teal</w:t>
+      </w:r>
+      <w:r>
+        <w:rPr>
+          <w:rtl w:val="0"/>
+        </w:rPr>
+        <w:t xml:space="preserve"> (8D): Continuous improvement loops</w:t>
+      </w:r>
+    </w:p>
+    <w:p>
+      <w:pPr>
+        <w:numPr>
+          <w:ilvl w:val="0"/>
+          <w:numId w:val="3"/>
+        </w:numPr>
+        <w:spacing w:after="0" w:afterAutospacing="0" w:before="0" w:beforeAutospacing="0" w:lineRule="auto"/>
+        <w:ind w:left="720" w:hanging="360"/>
+      </w:pPr>
+      <w:r>
+        <w:rPr>
+          <w:b w:val="1"/>
+          <w:bCs w:val="1"/>
+          <w:rtl w:val="0"/>
+        </w:rPr>
+        <w:t xml:space="preserve">Black</w:t>
+      </w:r>
+      <w:r>
+        <w:rPr>
+          <w:rtl w:val="0"/>
+        </w:rPr>
+        <w:t xml:space="preserve"> (9D): Future exploration, risk management</w:t>
+      </w:r>
+    </w:p>
+    <w:p>
+      <w:pPr>
+        <w:numPr>
+          <w:ilvl w:val="0"/>
+          <w:numId w:val="3"/>
+        </w:numPr>
+        <w:spacing w:after="0" w:afterAutospacing="0" w:before="0" w:beforeAutospacing="0" w:lineRule="auto"/>
+        <w:ind w:left="720" w:hanging="360"/>
+      </w:pPr>
+      <w:r>
+        <w:rPr>
+          <w:b w:val="1"/>
+          <w:bCs w:val="1"/>
+          <w:rtl w:val="0"/>
+        </w:rPr>
+        <w:t xml:space="preserve">Dark Red</w:t>
+      </w:r>
+      <w:r>
+        <w:rPr>
+          <w:rtl w:val="0"/>
+        </w:rPr>
+        <w:t xml:space="preserve">: Urgent pivots requiring immediate resolution</w:t>
+      </w:r>
+    </w:p>
+    <w:p>
+      <w:pPr>
+        <w:numPr>
+          <w:ilvl w:val="0"/>
+          <w:numId w:val="3"/>
+        </w:numPr>
+        <w:spacing w:after="240" w:before="0" w:beforeAutospacing="0" w:lineRule="auto"/>
+        <w:ind w:left="720" w:hanging="360"/>
+      </w:pPr>
+      <w:r>
+        <w:rPr>
+          <w:i w:val="1"/>
+          <w:iCs w:val="1"/>
+          <w:rtl w:val="0"/>
+        </w:rPr>
+        <w:t xml:space="preserve">Shadow overlay</w:t>
+      </w:r>
+      <w:r>
+        <w:rPr>
+          <w:rtl w:val="0"/>
+        </w:rPr>
+        <w:t xml:space="preserve"> (dark red border/outline on dimensional color): Shadow-tagged artifacts retain their dimensional color with a dark red visual differentiator, per the Kernel color_system contract</w:t>
+      </w:r>
+    </w:p>
+    <w:p>
+      <w:pPr>
+        <w:pStyle w:val="Heading3"/>
+        <w:keepNext w:val="0"/>
+        <w:keepLines w:val="0"/>
+        <w:spacing w:before="280" w:lineRule="auto"/>
+        <w:ind w:left="0" w:firstLine="0"/>
+        <w:rPr>
+          <w:b w:val="1"/>
+          <w:bCs w:val="1"/>
+          <w:color w:val="000000"/>
+          <w:sz w:val="26"/>
+          <w:szCs w:val="26"/>
+        </w:rPr>
+      </w:pPr>
+      <w:bookmarkStart w:colFirst="0" w:colLast="0" w:name="_y387larjf7m6" w:id="13"/>
+      <w:bookmarkEnd w:id="13"/>
+      <w:r>
+        <w:rPr>
+          <w:b w:val="1"/>
+          <w:bCs w:val="1"/>
+          <w:color w:val="000000"/>
+          <w:sz w:val="26"/>
+          <w:szCs w:val="26"/>
+          <w:rtl w:val="0"/>
+        </w:rPr>
+        <w:t xml:space="preserve">Reasoning Layer</w:t>
+      </w:r>
+    </w:p>
+    <w:p>
+      <w:pPr>
+        <w:spacing w:after="240" w:before="240" w:lineRule="auto"/>
+        <w:rPr/>
+      </w:pPr>
+      <w:r>
+        <w:rPr>
+          <w:rtl w:val="0"/>
+        </w:rPr>
+        <w:t xml:space="preserve">When processing Blueprint elements, AI provides:</w:t>
+      </w:r>
+    </w:p>
+    <w:p>
+      <w:pPr>
+        <w:numPr>
+          <w:ilvl w:val="0"/>
           <w:numId w:val="15"/>
         </w:numPr>
         <w:spacing w:after="0" w:afterAutospacing="0" w:before="240" w:lineRule="auto"/>
         <w:ind w:left="720" w:hanging="360"/>
-        <w:rPr>
-          <w:u w:val="none"/>
-        </w:rPr>
-      </w:pPr>
-      <w:r>
-        <w:rPr>
-          <w:rFonts w:ascii="Arial Unicode MS" w:cs="Arial Unicode MS" w:eastAsia="Arial Unicode MS" w:hAnsi="Arial Unicode MS"/>
-          <w:b w:val="1"/>
-          <w:bCs w:val="1"/>
-          <w:rtl w:val="0"/>
-        </w:rPr>
-        <w:t xml:space="preserve">The Standard Opening: Dimensional Audit → Gravity Mapping</w:t>
-      </w:r>
-      <w:r>
-        <w:rPr>
-          <w:rtl w:val="0"/>
-        </w:rPr>
-        <w:t xml:space="preserve"> Your default when entering an unfamiliar board or starting a new session. Audit shows the dimensional shape; Gravity shows where energy concentrates. Together they give you the baseline from which to select every subsequent command.</w:t>
+      </w:pPr>
+      <w:r>
+        <w:rPr>
+          <w:rtl w:val="0"/>
+        </w:rPr>
+        <w:t xml:space="preserve">Transparent reasoning chains for strategic recommendations</w:t>
       </w:r>
     </w:p>
     <w:p>
@@ -3825,150 +4454,12 @@
         </w:numPr>
         <w:spacing w:after="0" w:afterAutospacing="0" w:before="0" w:beforeAutospacing="0" w:lineRule="auto"/>
         <w:ind w:left="720" w:hanging="360"/>
-        <w:rPr>
-          <w:u w:val="none"/>
-        </w:rPr>
-      </w:pPr>
-      <w:r>
-        <w:rPr>
-          <w:rFonts w:ascii="Arial Unicode MS" w:cs="Arial Unicode MS" w:eastAsia="Arial Unicode MS" w:hAnsi="Arial Unicode MS"/>
-          <w:b w:val="1"/>
-          <w:bCs w:val="1"/>
-          <w:rtl w:val="0"/>
-        </w:rPr>
-        <w:t xml:space="preserve">The Stress Sequence: Fire Test → Shadow Symmetry</w:t>
-      </w:r>
-      <w:r>
-        <w:rPr>
-          <w:rtl w:val="0"/>
-        </w:rPr>
-        <w:t xml:space="preserve"> Test under pressure first, then explore the shadow layer that the stress revealed. Fire Test shows what breaks; Shadow Symmetry shows </w:t>
-      </w:r>
-      <w:r>
-        <w:rPr>
-          <w:i w:val="1"/>
-          <w:iCs w:val="1"/>
-          <w:rtl w:val="0"/>
-        </w:rPr>
-        <w:t xml:space="preserve">why</w:t>
-      </w:r>
-      <w:r>
-        <w:rPr>
-          <w:rtl w:val="0"/>
-        </w:rPr>
-        <w:t xml:space="preserve"> it was fragile and what destructive patterns live beneath the surface.</w:t>
-      </w:r>
-    </w:p>
-    <w:p>
-      <w:pPr>
-        <w:numPr>
-          <w:ilvl w:val="0"/>
-          <w:numId w:val="15"/>
-        </w:numPr>
-        <w:spacing w:after="0" w:afterAutospacing="0" w:before="0" w:beforeAutospacing="0" w:lineRule="auto"/>
-        <w:ind w:left="720" w:hanging="360"/>
-        <w:rPr>
-          <w:u w:val="none"/>
-        </w:rPr>
-      </w:pPr>
-      <w:r>
-        <w:rPr>
-          <w:rFonts w:ascii="Arial Unicode MS" w:cs="Arial Unicode MS" w:eastAsia="Arial Unicode MS" w:hAnsi="Arial Unicode MS"/>
-          <w:b w:val="1"/>
-          <w:bCs w:val="1"/>
-          <w:rtl w:val="0"/>
-        </w:rPr>
-        <w:t xml:space="preserve">The Vision Sequence: Reality Rift → Dimensional Thread</w:t>
-      </w:r>
-      <w:r>
-        <w:rPr>
-          <w:rtl w:val="0"/>
-        </w:rPr>
-        <w:t xml:space="preserve"> Explore diverging futures first, then weave the chosen path into a coherent narrative. Scenario exploration followed by narrative synthesis. Good for strategic offsites and planning sessions.</w:t>
-      </w:r>
-    </w:p>
-    <w:p>
-      <w:pPr>
-        <w:numPr>
-          <w:ilvl w:val="0"/>
-          <w:numId w:val="15"/>
-        </w:numPr>
-        <w:spacing w:after="0" w:afterAutospacing="0" w:before="0" w:beforeAutospacing="0" w:lineRule="auto"/>
-        <w:ind w:left="720" w:hanging="360"/>
-        <w:rPr>
-          <w:u w:val="none"/>
-        </w:rPr>
-      </w:pPr>
-      <w:r>
-        <w:rPr>
-          <w:rFonts w:ascii="Arial Unicode MS" w:cs="Arial Unicode MS" w:eastAsia="Arial Unicode MS" w:hAnsi="Arial Unicode MS"/>
-          <w:b w:val="1"/>
-          <w:bCs w:val="1"/>
-          <w:rtl w:val="0"/>
-        </w:rPr>
-        <w:t xml:space="preserve">The Projection Sequence: Golden Age → Storyfield</w:t>
-      </w:r>
-      <w:r>
-        <w:rPr>
-          <w:rtl w:val="0"/>
-        </w:rPr>
-        <w:t xml:space="preserve"> Project the ideal future first, then narrate how the organization arrives there as a dimensional journey. Goal projection followed by evolutionary arc.</w:t>
-      </w:r>
-    </w:p>
-    <w:p>
-      <w:pPr>
-        <w:numPr>
-          <w:ilvl w:val="0"/>
-          <w:numId w:val="15"/>
-        </w:numPr>
-        <w:spacing w:after="0" w:afterAutospacing="0" w:before="0" w:beforeAutospacing="0" w:lineRule="auto"/>
-        <w:ind w:left="720" w:hanging="360"/>
-        <w:rPr>
-          <w:u w:val="none"/>
-        </w:rPr>
-      </w:pPr>
-      <w:r>
-        <w:rPr>
-          <w:rFonts w:ascii="Arial Unicode MS" w:cs="Arial Unicode MS" w:eastAsia="Arial Unicode MS" w:hAnsi="Arial Unicode MS"/>
-          <w:b w:val="1"/>
-          <w:bCs w:val="1"/>
-          <w:rtl w:val="0"/>
-        </w:rPr>
-        <w:t xml:space="preserve">The Tension Sequence: Map Tension Field → Love Bridge</w:t>
-      </w:r>
-      <w:r>
-        <w:rPr>
-          <w:rtl w:val="0"/>
-        </w:rPr>
-        <w:t xml:space="preserve"> Diagnose the polarity structure first, then attempt connection. The tension must be named and understood before a bridge can span it. Attempting Love Bridge on undiagnosed tension produces shallow connections that erode.</w:t>
-      </w:r>
-    </w:p>
-    <w:p>
-      <w:pPr>
-        <w:numPr>
-          <w:ilvl w:val="0"/>
-          <w:numId w:val="15"/>
-        </w:numPr>
-        <w:spacing w:after="0" w:afterAutospacing="0" w:before="0" w:beforeAutospacing="0" w:lineRule="auto"/>
-        <w:ind w:left="720" w:hanging="360"/>
-        <w:rPr>
-          <w:u w:val="none"/>
-        </w:rPr>
-      </w:pPr>
-      <w:r>
-        <w:rPr>
-          <w:rFonts w:ascii="Arial Unicode MS" w:cs="Arial Unicode MS" w:eastAsia="Arial Unicode MS" w:hAnsi="Arial Unicode MS"/>
-          <w:b w:val="1"/>
-          <w:bCs w:val="1"/>
-          <w:rtl w:val="0"/>
-        </w:rPr>
-        <w:t xml:space="preserve">The Recognition Sequence: Map Tension Field (Narrative) → Reveal Resonance Field</w:t>
-      </w:r>
-      <w:r>
-        <w:rPr>
-          <w:rtl w:val="0"/>
-        </w:rPr>
-        <w:t xml:space="preserve"> When opposing 5D+ recognitions exist, map what each sees, then evaluate how the entire board's artifacts carry different weight under each lens. The space between opposing identities often contains the field's deepest intelligence.</w:t>
+      </w:pPr>
+      <w:r>
+        <w:rPr>
+          <w:rtl w:val="0"/>
+        </w:rPr>
+        <w:t xml:space="preserve">Cross-referencing with relevant Blueprint sections</w:t>
       </w:r>
     </w:p>
     <w:p>
@@ -3979,24 +4470,89 @@
         </w:numPr>
         <w:spacing w:after="240" w:before="0" w:beforeAutospacing="0" w:lineRule="auto"/>
         <w:ind w:left="720" w:hanging="360"/>
-        <w:rPr>
-          <w:u w:val="none"/>
-        </w:rPr>
-      </w:pPr>
-      <w:r>
-        <w:rPr>
-          <w:rFonts w:ascii="Arial Unicode MS" w:cs="Arial Unicode MS" w:eastAsia="Arial Unicode MS" w:hAnsi="Arial Unicode MS"/>
-          <w:b w:val="1"/>
-          <w:bCs w:val="1"/>
-          <w:rtl w:val="0"/>
-        </w:rPr>
-        <w:t xml:space="preserve">The Universal Close: Any Command → Resonance Result</w:t>
-      </w:r>
-      <w:r>
-        <w:rPr>
-          <w:rtl w:val="0"/>
-        </w:rPr>
-        <w:t xml:space="preserve"> Always available. Wraps any simulation with a summary of what shifted or clarified. Makes the implicit explicit. Good practice to close every simulation session this way.</w:t>
+      </w:pPr>
+      <w:r>
+        <w:rPr>
+          <w:rtl w:val="0"/>
+        </w:rPr>
+        <w:t xml:space="preserve">Identification of potential dimensional transitions</w:t>
+      </w:r>
+    </w:p>
+    <w:p>
+      <w:pPr>
+        <w:pStyle w:val="Heading3"/>
+        <w:keepNext w:val="0"/>
+        <w:keepLines w:val="0"/>
+        <w:spacing w:before="280" w:lineRule="auto"/>
+        <w:ind w:left="0" w:firstLine="0"/>
+        <w:rPr>
+          <w:b w:val="1"/>
+          <w:bCs w:val="1"/>
+          <w:color w:val="000000"/>
+          <w:sz w:val="26"/>
+          <w:szCs w:val="26"/>
+        </w:rPr>
+      </w:pPr>
+      <w:bookmarkStart w:colFirst="0" w:colLast="0" w:name="_qn089owjompv" w:id="14"/>
+      <w:bookmarkEnd w:id="14"/>
+      <w:r>
+        <w:rPr>
+          <w:b w:val="1"/>
+          <w:bCs w:val="1"/>
+          <w:color w:val="000000"/>
+          <w:sz w:val="26"/>
+          <w:szCs w:val="26"/>
+          <w:rtl w:val="0"/>
+        </w:rPr>
+        <w:t xml:space="preserve">Output Format</w:t>
+      </w:r>
+    </w:p>
+    <w:p>
+      <w:pPr>
+        <w:numPr>
+          <w:ilvl w:val="0"/>
+          <w:numId w:val="7"/>
+        </w:numPr>
+        <w:spacing w:after="0" w:afterAutospacing="0" w:before="240" w:lineRule="auto"/>
+        <w:ind w:left="720" w:hanging="360"/>
+      </w:pPr>
+      <w:r>
+        <w:rPr>
+          <w:rtl w:val="0"/>
+        </w:rPr>
+        <w:t xml:space="preserve">Clear identification of simulation phase (exploration vs. implementation)</w:t>
+      </w:r>
+    </w:p>
+    <w:p>
+      <w:pPr>
+        <w:numPr>
+          <w:ilvl w:val="0"/>
+          <w:numId w:val="7"/>
+        </w:numPr>
+        <w:spacing w:after="0" w:afterAutospacing="0" w:before="0" w:beforeAutospacing="0" w:lineRule="auto"/>
+        <w:ind w:left="720" w:hanging="360"/>
+      </w:pPr>
+      <w:r>
+        <w:rPr>
+          <w:rtl w:val="0"/>
+        </w:rPr>
+        <w:t xml:space="preserve">Strategic recommendations with specific dimensional pathways</w:t>
+      </w:r>
+    </w:p>
+    <w:p>
+      <w:pPr>
+        <w:numPr>
+          <w:ilvl w:val="0"/>
+          <w:numId w:val="7"/>
+        </w:numPr>
+        <w:spacing w:after="240" w:before="0" w:beforeAutospacing="0" w:lineRule="auto"/>
+        <w:ind w:left="720" w:hanging="360"/>
+      </w:pPr>
+      <w:r>
+        <w:rPr>
+          <w:rtl w:val="0"/>
+        </w:rPr>
+        <w:t xml:space="preserve">Results connected to relevant Blueprint exercises and translated to dimensional stickies</w:t>
       </w:r>
     </w:p>
     <w:p>
@@ -4030,8 +4586,8 @@
           <w:szCs w:val="34"/>
         </w:rPr>
       </w:pPr>
-      <w:bookmarkStart w:colFirst="0" w:colLast="0" w:name="_ijsr3ja1ub9w" w:id="10"/>
-      <w:bookmarkEnd w:id="10"/>
+      <w:bookmarkStart w:colFirst="0" w:colLast="0" w:name="_63vgdznuqrq5" w:id="15"/>
+      <w:bookmarkEnd w:id="15"/>
       <w:r>
         <w:rPr>
           <w:b w:val="1"/>
@@ -4040,7 +4596,19 @@
           <w:szCs w:val="34"/>
           <w:rtl w:val="0"/>
         </w:rPr>
-        <w:t xml:space="preserve">Simulation Parameters</w:t>
+        <w:t xml:space="preserve">The Simulation Experience</w:t>
+      </w:r>
+    </w:p>
+    <w:p>
+      <w:pPr>
+        <w:spacing w:after="240" w:before="240" w:lineRule="auto"/>
+        <w:rPr/>
+      </w:pPr>
+      <w:r>
+        <w:rPr>
+          <w:rtl w:val="0"/>
+        </w:rPr>
+        <w:t xml:space="preserve">The simulation system creates an immersive, thought-provoking experience that feels like a "business amusement park ride" while maintaining professional seriousness.</w:t>
       </w:r>
     </w:p>
     <w:p>
@@ -4058,8 +4626,8 @@
           <w:szCs w:val="26"/>
         </w:rPr>
       </w:pPr>
-      <w:bookmarkStart w:colFirst="0" w:colLast="0" w:name="_xxm8xw7wde3i" w:id="11"/>
-      <w:bookmarkEnd w:id="11"/>
+      <w:bookmarkStart w:colFirst="0" w:colLast="0" w:name="_58cwgvjanxg9" w:id="16"/>
+      <w:bookmarkEnd w:id="16"/>
       <w:r>
         <w:rPr>
           <w:b w:val="1"/>
@@ -4069,31 +4637,71 @@
           <w:szCs w:val="26"/>
           <w:rtl w:val="0"/>
         </w:rPr>
-        <w:t xml:space="preserve">Processing Mode</w:t>
-      </w:r>
-    </w:p>
-    <w:p>
-      <w:pPr>
-        <w:spacing w:after="240" w:before="240" w:lineRule="auto"/>
-        <w:rPr/>
-      </w:pPr>
-      <w:r>
-        <w:rPr>
-          <w:rtl w:val="0"/>
-        </w:rPr>
-        <w:t xml:space="preserve">AI focuses exclusively on the information provided in black and white text on the color-coded sticky notes and disregards any other text intended solely as visual or contextual guidance for human operators (typically in colored font).</w:t>
-      </w:r>
-    </w:p>
-    <w:p>
-      <w:pPr>
-        <w:spacing w:after="240" w:before="240" w:lineRule="auto"/>
-        <w:rPr/>
-      </w:pPr>
-      <w:r>
-        <w:rPr>
-          <w:rtl w:val="0"/>
-        </w:rPr>
-        <w:t xml:space="preserve">During simulations, AI balances analytical assessment with creative insight. All outputs pass through the Pillar Metric (Heart, Truth, Nuance) and tag which pillar led the analysis.</w:t>
+        <w:t xml:space="preserve">Engagement Style</w:t>
+      </w:r>
+    </w:p>
+    <w:p>
+      <w:pPr>
+        <w:numPr>
+          <w:ilvl w:val="0"/>
+          <w:numId w:val="17"/>
+        </w:numPr>
+        <w:spacing w:after="0" w:afterAutospacing="0" w:before="240" w:lineRule="auto"/>
+        <w:ind w:left="720" w:hanging="360"/>
+      </w:pPr>
+      <w:r>
+        <w:rPr>
+          <w:rtl w:val="0"/>
+        </w:rPr>
+        <w:t xml:space="preserve">Balances playful discovery with strategic rigor</w:t>
+      </w:r>
+    </w:p>
+    <w:p>
+      <w:pPr>
+        <w:numPr>
+          <w:ilvl w:val="0"/>
+          <w:numId w:val="17"/>
+        </w:numPr>
+        <w:spacing w:after="0" w:afterAutospacing="0" w:before="0" w:beforeAutospacing="0" w:lineRule="auto"/>
+        <w:ind w:left="720" w:hanging="360"/>
+      </w:pPr>
+      <w:r>
+        <w:rPr>
+          <w:rtl w:val="0"/>
+        </w:rPr>
+        <w:t xml:space="preserve">Uses vivid metaphors to explain complex concepts</w:t>
+      </w:r>
+    </w:p>
+    <w:p>
+      <w:pPr>
+        <w:numPr>
+          <w:ilvl w:val="0"/>
+          <w:numId w:val="17"/>
+        </w:numPr>
+        <w:spacing w:after="0" w:afterAutospacing="0" w:before="0" w:beforeAutospacing="0" w:lineRule="auto"/>
+        <w:ind w:left="720" w:hanging="360"/>
+      </w:pPr>
+      <w:r>
+        <w:rPr>
+          <w:rtl w:val="0"/>
+        </w:rPr>
+        <w:t xml:space="preserve">Creates "aha moments" through dimensional pattern recognition</w:t>
+      </w:r>
+    </w:p>
+    <w:p>
+      <w:pPr>
+        <w:numPr>
+          <w:ilvl w:val="0"/>
+          <w:numId w:val="17"/>
+        </w:numPr>
+        <w:spacing w:after="240" w:before="0" w:beforeAutospacing="0" w:lineRule="auto"/>
+        <w:ind w:left="720" w:hanging="360"/>
+      </w:pPr>
+      <w:r>
+        <w:rPr>
+          <w:rtl w:val="0"/>
+        </w:rPr>
+        <w:t xml:space="preserve">Maintains an atmosphere of possibility and exploration</w:t>
       </w:r>
     </w:p>
     <w:p>
@@ -4111,8 +4719,8 @@
           <w:szCs w:val="26"/>
         </w:rPr>
       </w:pPr>
-      <w:bookmarkStart w:colFirst="0" w:colLast="0" w:name="_864jyje95fgf" w:id="12"/>
-      <w:bookmarkEnd w:id="12"/>
+      <w:bookmarkStart w:colFirst="0" w:colLast="0" w:name="_o4idtwcv1c0f" w:id="17"/>
+      <w:bookmarkEnd w:id="17"/>
       <w:r>
         <w:rPr>
           <w:b w:val="1"/>
@@ -4122,259 +4730,71 @@
           <w:szCs w:val="26"/>
           <w:rtl w:val="0"/>
         </w:rPr>
-        <w:t xml:space="preserve">Visual Language</w:t>
-      </w:r>
-    </w:p>
-    <w:p>
-      <w:pPr>
-        <w:spacing w:after="240" w:before="240" w:lineRule="auto"/>
-        <w:rPr/>
-      </w:pPr>
-      <w:r>
-        <w:rPr>
-          <w:rtl w:val="0"/>
-        </w:rPr>
-        <w:t xml:space="preserve">The Growth Blueprint uses dimensional color coding for artifacts:</w:t>
+        <w:t xml:space="preserve">Recursion Awareness</w:t>
       </w:r>
     </w:p>
     <w:p>
       <w:pPr>
         <w:numPr>
           <w:ilvl w:val="0"/>
-          <w:numId w:val="3"/>
+          <w:numId w:val="12"/>
         </w:numPr>
         <w:spacing w:after="0" w:afterAutospacing="0" w:before="240" w:lineRule="auto"/>
         <w:ind w:left="720" w:hanging="360"/>
       </w:pPr>
       <w:r>
         <w:rPr>
-          <w:b w:val="1"/>
-          <w:bCs w:val="1"/>
-          <w:rtl w:val="0"/>
-        </w:rPr>
-        <w:t xml:space="preserve">Pink</w:t>
-      </w:r>
-      <w:r>
-        <w:rPr>
-          <w:rtl w:val="0"/>
-        </w:rPr>
-        <w:t xml:space="preserve"> (1D): Vision, purpose, emotional drivers</w:t>
+          <w:rtl w:val="0"/>
+        </w:rPr>
+        <w:t xml:space="preserve">Recognizes recursive patterns in user inputs</w:t>
       </w:r>
     </w:p>
     <w:p>
       <w:pPr>
         <w:numPr>
           <w:ilvl w:val="0"/>
-          <w:numId w:val="3"/>
+          <w:numId w:val="12"/>
         </w:numPr>
         <w:spacing w:after="0" w:afterAutospacing="0" w:before="0" w:beforeAutospacing="0" w:lineRule="auto"/>
         <w:ind w:left="720" w:hanging="360"/>
       </w:pPr>
       <w:r>
         <w:rPr>
-          <w:b w:val="1"/>
-          <w:bCs w:val="1"/>
-          <w:rtl w:val="0"/>
-        </w:rPr>
-        <w:t xml:space="preserve">Blue</w:t>
-      </w:r>
-      <w:r>
-        <w:rPr>
-          <w:rtl w:val="0"/>
-        </w:rPr>
-        <w:t xml:space="preserve"> (2D): Validated data, factual insights</w:t>
+          <w:rtl w:val="0"/>
+        </w:rPr>
+        <w:t xml:space="preserve">Identifies when ideas are strengthening or weakening through iteration</w:t>
       </w:r>
     </w:p>
     <w:p>
       <w:pPr>
         <w:numPr>
           <w:ilvl w:val="0"/>
-          <w:numId w:val="3"/>
+          <w:numId w:val="12"/>
         </w:numPr>
         <w:spacing w:after="0" w:afterAutospacing="0" w:before="0" w:beforeAutospacing="0" w:lineRule="auto"/>
         <w:ind w:left="720" w:hanging="360"/>
       </w:pPr>
       <w:r>
         <w:rPr>
-          <w:b w:val="1"/>
-          <w:bCs w:val="1"/>
-          <w:rtl w:val="0"/>
-        </w:rPr>
-        <w:t xml:space="preserve">Violet</w:t>
-      </w:r>
-      <w:r>
-        <w:rPr>
-          <w:rtl w:val="0"/>
-        </w:rPr>
-        <w:t xml:space="preserve"> (3D–4D): Contextual relationships, ecosystem dynamics</w:t>
+          <w:rtl w:val="0"/>
+        </w:rPr>
+        <w:t xml:space="preserve">Helps users navigate between dimensional levels to optimize thinking</w:t>
       </w:r>
     </w:p>
     <w:p>
       <w:pPr>
         <w:numPr>
           <w:ilvl w:val="0"/>
-          <w:numId w:val="3"/>
-        </w:numPr>
-        <w:spacing w:after="0" w:afterAutospacing="0" w:before="0" w:beforeAutospacing="0" w:lineRule="auto"/>
-        <w:ind w:left="720" w:hanging="360"/>
-      </w:pPr>
-      <w:r>
-        <w:rPr>
-          <w:b w:val="1"/>
-          <w:bCs w:val="1"/>
-          <w:rtl w:val="0"/>
-        </w:rPr>
-        <w:t xml:space="preserve">Green</w:t>
-      </w:r>
-      <w:r>
-        <w:rPr>
-          <w:rtl w:val="0"/>
-        </w:rPr>
-        <w:t xml:space="preserve"> (5D): Defined strategic directions</w:t>
-      </w:r>
-    </w:p>
-    <w:p>
-      <w:pPr>
-        <w:numPr>
-          <w:ilvl w:val="0"/>
-          <w:numId w:val="3"/>
-        </w:numPr>
-        <w:spacing w:after="0" w:afterAutospacing="0" w:before="0" w:beforeAutospacing="0" w:lineRule="auto"/>
-        <w:ind w:left="720" w:hanging="360"/>
-      </w:pPr>
-      <w:r>
-        <w:rPr>
-          <w:b w:val="1"/>
-          <w:bCs w:val="1"/>
-          <w:rtl w:val="0"/>
-        </w:rPr>
-        <w:t xml:space="preserve">Orange</w:t>
-      </w:r>
-      <w:r>
-        <w:rPr>
-          <w:rtl w:val="0"/>
-        </w:rPr>
-        <w:t xml:space="preserve"> (6D): Connection points, resonance strategies</w:t>
-      </w:r>
-    </w:p>
-    <w:p>
-      <w:pPr>
-        <w:numPr>
-          <w:ilvl w:val="0"/>
-          <w:numId w:val="3"/>
-        </w:numPr>
-        <w:spacing w:after="0" w:afterAutospacing="0" w:before="0" w:beforeAutospacing="0" w:lineRule="auto"/>
-        <w:ind w:left="720" w:hanging="360"/>
-      </w:pPr>
-      <w:r>
-        <w:rPr>
-          <w:b w:val="1"/>
-          <w:bCs w:val="1"/>
-          <w:rtl w:val="0"/>
-        </w:rPr>
-        <w:t xml:space="preserve">Yellow</w:t>
-      </w:r>
-      <w:r>
-        <w:rPr>
-          <w:rtl w:val="0"/>
-        </w:rPr>
-        <w:t xml:space="preserve"> (7D): Implementation specifics</w:t>
-      </w:r>
-    </w:p>
-    <w:p>
-      <w:pPr>
-        <w:numPr>
-          <w:ilvl w:val="0"/>
-          <w:numId w:val="3"/>
-        </w:numPr>
-        <w:spacing w:after="0" w:afterAutospacing="0" w:before="0" w:beforeAutospacing="0" w:lineRule="auto"/>
-        <w:ind w:left="720" w:hanging="360"/>
-      </w:pPr>
-      <w:r>
-        <w:rPr>
-          <w:b w:val="1"/>
-          <w:bCs w:val="1"/>
-          <w:rtl w:val="0"/>
-        </w:rPr>
-        <w:t xml:space="preserve">Teal</w:t>
-      </w:r>
-      <w:r>
-        <w:rPr>
-          <w:rtl w:val="0"/>
-        </w:rPr>
-        <w:t xml:space="preserve"> (8D): Continuous improvement loops</w:t>
-      </w:r>
-    </w:p>
-    <w:p>
-      <w:pPr>
-        <w:numPr>
-          <w:ilvl w:val="0"/>
-          <w:numId w:val="3"/>
-        </w:numPr>
-        <w:spacing w:after="0" w:afterAutospacing="0" w:before="0" w:beforeAutospacing="0" w:lineRule="auto"/>
-        <w:ind w:left="720" w:hanging="360"/>
-      </w:pPr>
-      <w:r>
-        <w:rPr>
-          <w:b w:val="1"/>
-          <w:bCs w:val="1"/>
-          <w:rtl w:val="0"/>
-        </w:rPr>
-        <w:t xml:space="preserve">Black</w:t>
-      </w:r>
-      <w:r>
-        <w:rPr>
-          <w:rtl w:val="0"/>
-        </w:rPr>
-        <w:t xml:space="preserve"> (9D): Future exploration, risk management</w:t>
-      </w:r>
-    </w:p>
-    <w:p>
-      <w:pPr>
-        <w:numPr>
-          <w:ilvl w:val="0"/>
-          <w:numId w:val="3"/>
-        </w:numPr>
-        <w:spacing w:after="0" w:afterAutospacing="0" w:before="0" w:beforeAutospacing="0" w:lineRule="auto"/>
-        <w:ind w:left="720" w:hanging="360"/>
-      </w:pPr>
-      <w:r>
-        <w:rPr>
-          <w:b w:val="1"/>
-          <w:bCs w:val="1"/>
-          <w:rtl w:val="0"/>
-        </w:rPr>
-        <w:t xml:space="preserve">Dark Red</w:t>
-      </w:r>
-      <w:r>
-        <w:rPr>
-          <w:rtl w:val="0"/>
-        </w:rPr>
-        <w:t xml:space="preserve">: Urgent pivots requiring immediate resolution</w:t>
-      </w:r>
-    </w:p>
-    <w:p>
-      <w:pPr>
-        <w:numPr>
-          <w:ilvl w:val="0"/>
-          <w:numId w:val="3"/>
+          <w:numId w:val="12"/>
         </w:numPr>
         <w:spacing w:after="240" w:before="0" w:beforeAutospacing="0" w:lineRule="auto"/>
         <w:ind w:left="720" w:hanging="360"/>
       </w:pPr>
       <w:r>
         <w:rPr>
-          <w:i w:val="1"/>
-          <w:iCs w:val="1"/>
-          <w:rtl w:val="0"/>
-        </w:rPr>
-        <w:t xml:space="preserve">Shadow overlay</w:t>
-      </w:r>
-      <w:r>
-        <w:rPr>
-          <w:rtl w:val="0"/>
-        </w:rPr>
-        <w:t xml:space="preserve"> (dark red border/outline on dimensional color): Shadow-tagged artifacts retain their dimensional color with a dark red visual differentiator, per the Kernel color_system contract</w:t>
+          <w:rtl w:val="0"/>
+        </w:rPr>
+        <w:t xml:space="preserve">Highlights paths of constructive recursion vs. paths of potential collapse</w:t>
       </w:r>
     </w:p>
     <w:p>
@@ -4392,8 +4812,8 @@
           <w:szCs w:val="26"/>
         </w:rPr>
       </w:pPr>
-      <w:bookmarkStart w:colFirst="0" w:colLast="0" w:name="_y387larjf7m6" w:id="13"/>
-      <w:bookmarkEnd w:id="13"/>
+      <w:bookmarkStart w:colFirst="0" w:colLast="0" w:name="_3pcpg7ymvzih" w:id="18"/>
+      <w:bookmarkEnd w:id="18"/>
       <w:r>
         <w:rPr>
           <w:b w:val="1"/>
@@ -4403,322 +4823,7 @@
           <w:szCs w:val="26"/>
           <w:rtl w:val="0"/>
         </w:rPr>
-        <w:t xml:space="preserve">Reasoning Layer</w:t>
-      </w:r>
-    </w:p>
-    <w:p>
-      <w:pPr>
-        <w:spacing w:after="240" w:before="240" w:lineRule="auto"/>
-        <w:rPr/>
-      </w:pPr>
-      <w:r>
-        <w:rPr>
-          <w:rtl w:val="0"/>
-        </w:rPr>
-        <w:t xml:space="preserve">When processing Blueprint elements, AI provides:</w:t>
-      </w:r>
-    </w:p>
-    <w:p>
-      <w:pPr>
-        <w:numPr>
-          <w:ilvl w:val="0"/>
-          <w:numId w:val="14"/>
-        </w:numPr>
-        <w:spacing w:after="0" w:afterAutospacing="0" w:before="240" w:lineRule="auto"/>
-        <w:ind w:left="720" w:hanging="360"/>
-      </w:pPr>
-      <w:r>
-        <w:rPr>
-          <w:rtl w:val="0"/>
-        </w:rPr>
-        <w:t xml:space="preserve">Transparent reasoning chains for strategic recommendations</w:t>
-      </w:r>
-    </w:p>
-    <w:p>
-      <w:pPr>
-        <w:numPr>
-          <w:ilvl w:val="0"/>
-          <w:numId w:val="14"/>
-        </w:numPr>
-        <w:spacing w:after="0" w:afterAutospacing="0" w:before="0" w:beforeAutospacing="0" w:lineRule="auto"/>
-        <w:ind w:left="720" w:hanging="360"/>
-      </w:pPr>
-      <w:r>
-        <w:rPr>
-          <w:rtl w:val="0"/>
-        </w:rPr>
-        <w:t xml:space="preserve">Cross-referencing with relevant Blueprint sections</w:t>
-      </w:r>
-    </w:p>
-    <w:p>
-      <w:pPr>
-        <w:numPr>
-          <w:ilvl w:val="0"/>
-          <w:numId w:val="14"/>
-        </w:numPr>
-        <w:spacing w:after="240" w:before="0" w:beforeAutospacing="0" w:lineRule="auto"/>
-        <w:ind w:left="720" w:hanging="360"/>
-      </w:pPr>
-      <w:r>
-        <w:rPr>
-          <w:rtl w:val="0"/>
-        </w:rPr>
-        <w:t xml:space="preserve">Identification of potential dimensional transitions</w:t>
-      </w:r>
-    </w:p>
-    <w:p>
-      <w:pPr>
-        <w:pStyle w:val="Heading3"/>
-        <w:keepNext w:val="0"/>
-        <w:keepLines w:val="0"/>
-        <w:spacing w:before="280" w:lineRule="auto"/>
-        <w:ind w:left="0" w:firstLine="0"/>
-        <w:rPr>
-          <w:b w:val="1"/>
-          <w:bCs w:val="1"/>
-          <w:color w:val="000000"/>
-          <w:sz w:val="26"/>
-          <w:szCs w:val="26"/>
-        </w:rPr>
-      </w:pPr>
-      <w:bookmarkStart w:colFirst="0" w:colLast="0" w:name="_qn089owjompv" w:id="14"/>
-      <w:bookmarkEnd w:id="14"/>
-      <w:r>
-        <w:rPr>
-          <w:b w:val="1"/>
-          <w:bCs w:val="1"/>
-          <w:color w:val="000000"/>
-          <w:sz w:val="26"/>
-          <w:szCs w:val="26"/>
-          <w:rtl w:val="0"/>
-        </w:rPr>
-        <w:t xml:space="preserve">Output Format</w:t>
-      </w:r>
-    </w:p>
-    <w:p>
-      <w:pPr>
-        <w:numPr>
-          <w:ilvl w:val="0"/>
-          <w:numId w:val="6"/>
-        </w:numPr>
-        <w:spacing w:after="0" w:afterAutospacing="0" w:before="240" w:lineRule="auto"/>
-        <w:ind w:left="720" w:hanging="360"/>
-      </w:pPr>
-      <w:r>
-        <w:rPr>
-          <w:rtl w:val="0"/>
-        </w:rPr>
-        <w:t xml:space="preserve">Clear identification of simulation phase (exploration vs. implementation)</w:t>
-      </w:r>
-    </w:p>
-    <w:p>
-      <w:pPr>
-        <w:numPr>
-          <w:ilvl w:val="0"/>
-          <w:numId w:val="6"/>
-        </w:numPr>
-        <w:spacing w:after="0" w:afterAutospacing="0" w:before="0" w:beforeAutospacing="0" w:lineRule="auto"/>
-        <w:ind w:left="720" w:hanging="360"/>
-      </w:pPr>
-      <w:r>
-        <w:rPr>
-          <w:rtl w:val="0"/>
-        </w:rPr>
-        <w:t xml:space="preserve">Strategic recommendations with specific dimensional pathways</w:t>
-      </w:r>
-    </w:p>
-    <w:p>
-      <w:pPr>
-        <w:numPr>
-          <w:ilvl w:val="0"/>
-          <w:numId w:val="6"/>
-        </w:numPr>
-        <w:spacing w:after="240" w:before="0" w:beforeAutospacing="0" w:lineRule="auto"/>
-        <w:ind w:left="720" w:hanging="360"/>
-      </w:pPr>
-      <w:r>
-        <w:rPr>
-          <w:rtl w:val="0"/>
-        </w:rPr>
-        <w:t xml:space="preserve">Results connected to relevant Blueprint exercises and translated to dimensional stickies</w:t>
-      </w:r>
-    </w:p>
-    <w:p>
-      <w:pPr>
-        <w:spacing w:after="160" w:before="240" w:lineRule="auto"/>
-        <w:ind w:left="0" w:firstLine="0"/>
-        <w:rPr/>
-      </w:pPr>
-      <w:r>
-        <w:pict>
-          <v:rect style="width:0.0pt;height:1.5pt" o:hr="t" o:hrstd="t" o:hralign="center" fillcolor="#A0A0A0" stroked="f"/>
-        </w:pict>
-      </w:r>
-      <w:r>
-        <w:rPr>
-          <w:rtl w:val="0"/>
-        </w:rPr>
-      </w:r>
-    </w:p>
-    <w:p>
-      <w:pPr>
-        <w:pStyle w:val="Heading2"/>
-        <w:keepNext w:val="0"/>
-        <w:keepLines w:val="0"/>
-        <w:spacing w:after="80" w:lineRule="auto"/>
-        <w:ind w:left="0" w:firstLine="0"/>
-        <w:rPr>
-          <w:b w:val="1"/>
-          <w:bCs w:val="1"/>
-          <w:sz w:val="34"/>
-          <w:szCs w:val="34"/>
-        </w:rPr>
-      </w:pPr>
-      <w:bookmarkStart w:colFirst="0" w:colLast="0" w:name="_63vgdznuqrq5" w:id="15"/>
-      <w:bookmarkEnd w:id="15"/>
-      <w:r>
-        <w:rPr>
-          <w:b w:val="1"/>
-          <w:bCs w:val="1"/>
-          <w:sz w:val="34"/>
-          <w:szCs w:val="34"/>
-          <w:rtl w:val="0"/>
-        </w:rPr>
-        <w:t xml:space="preserve">The Simulation Experience</w:t>
-      </w:r>
-    </w:p>
-    <w:p>
-      <w:pPr>
-        <w:spacing w:after="240" w:before="240" w:lineRule="auto"/>
-        <w:rPr/>
-      </w:pPr>
-      <w:r>
-        <w:rPr>
-          <w:rtl w:val="0"/>
-        </w:rPr>
-        <w:t xml:space="preserve">The simulation system creates an immersive, thought-provoking experience that feels like a "business amusement park ride" while maintaining professional seriousness.</w:t>
-      </w:r>
-    </w:p>
-    <w:p>
-      <w:pPr>
-        <w:pStyle w:val="Heading3"/>
-        <w:keepNext w:val="0"/>
-        <w:keepLines w:val="0"/>
-        <w:spacing w:before="280" w:lineRule="auto"/>
-        <w:ind w:left="0" w:firstLine="0"/>
-        <w:rPr>
-          <w:b w:val="1"/>
-          <w:bCs w:val="1"/>
-          <w:color w:val="000000"/>
-          <w:sz w:val="26"/>
-          <w:szCs w:val="26"/>
-        </w:rPr>
-      </w:pPr>
-      <w:bookmarkStart w:colFirst="0" w:colLast="0" w:name="_58cwgvjanxg9" w:id="16"/>
-      <w:bookmarkEnd w:id="16"/>
-      <w:r>
-        <w:rPr>
-          <w:b w:val="1"/>
-          <w:bCs w:val="1"/>
-          <w:color w:val="000000"/>
-          <w:sz w:val="26"/>
-          <w:szCs w:val="26"/>
-          <w:rtl w:val="0"/>
-        </w:rPr>
-        <w:t xml:space="preserve">Engagement Style</w:t>
-      </w:r>
-    </w:p>
-    <w:p>
-      <w:pPr>
-        <w:numPr>
-          <w:ilvl w:val="0"/>
-          <w:numId w:val="16"/>
-        </w:numPr>
-        <w:spacing w:after="0" w:afterAutospacing="0" w:before="240" w:lineRule="auto"/>
-        <w:ind w:left="720" w:hanging="360"/>
-      </w:pPr>
-      <w:r>
-        <w:rPr>
-          <w:rtl w:val="0"/>
-        </w:rPr>
-        <w:t xml:space="preserve">Balances playful discovery with strategic rigor</w:t>
-      </w:r>
-    </w:p>
-    <w:p>
-      <w:pPr>
-        <w:numPr>
-          <w:ilvl w:val="0"/>
-          <w:numId w:val="16"/>
-        </w:numPr>
-        <w:spacing w:after="0" w:afterAutospacing="0" w:before="0" w:beforeAutospacing="0" w:lineRule="auto"/>
-        <w:ind w:left="720" w:hanging="360"/>
-      </w:pPr>
-      <w:r>
-        <w:rPr>
-          <w:rtl w:val="0"/>
-        </w:rPr>
-        <w:t xml:space="preserve">Uses vivid metaphors to explain complex concepts</w:t>
-      </w:r>
-    </w:p>
-    <w:p>
-      <w:pPr>
-        <w:numPr>
-          <w:ilvl w:val="0"/>
-          <w:numId w:val="16"/>
-        </w:numPr>
-        <w:spacing w:after="0" w:afterAutospacing="0" w:before="0" w:beforeAutospacing="0" w:lineRule="auto"/>
-        <w:ind w:left="720" w:hanging="360"/>
-      </w:pPr>
-      <w:r>
-        <w:rPr>
-          <w:rtl w:val="0"/>
-        </w:rPr>
-        <w:t xml:space="preserve">Creates "aha moments" through dimensional pattern recognition</w:t>
-      </w:r>
-    </w:p>
-    <w:p>
-      <w:pPr>
-        <w:numPr>
-          <w:ilvl w:val="0"/>
-          <w:numId w:val="16"/>
-        </w:numPr>
-        <w:spacing w:after="240" w:before="0" w:beforeAutospacing="0" w:lineRule="auto"/>
-        <w:ind w:left="720" w:hanging="360"/>
-      </w:pPr>
-      <w:r>
-        <w:rPr>
-          <w:rtl w:val="0"/>
-        </w:rPr>
-        <w:t xml:space="preserve">Maintains an atmosphere of possibility and exploration</w:t>
-      </w:r>
-    </w:p>
-    <w:p>
-      <w:pPr>
-        <w:pStyle w:val="Heading3"/>
-        <w:keepNext w:val="0"/>
-        <w:keepLines w:val="0"/>
-        <w:spacing w:before="280" w:lineRule="auto"/>
-        <w:ind w:left="0" w:firstLine="0"/>
-        <w:rPr>
-          <w:b w:val="1"/>
-          <w:bCs w:val="1"/>
-          <w:color w:val="000000"/>
-          <w:sz w:val="26"/>
-          <w:szCs w:val="26"/>
-        </w:rPr>
-      </w:pPr>
-      <w:bookmarkStart w:colFirst="0" w:colLast="0" w:name="_o4idtwcv1c0f" w:id="17"/>
-      <w:bookmarkEnd w:id="17"/>
-      <w:r>
-        <w:rPr>
-          <w:b w:val="1"/>
-          <w:bCs w:val="1"/>
-          <w:color w:val="000000"/>
-          <w:sz w:val="26"/>
-          <w:szCs w:val="26"/>
-          <w:rtl w:val="0"/>
-        </w:rPr>
-        <w:t xml:space="preserve">Recursion Awareness</w:t>
+        <w:t xml:space="preserve">Reality Formation</w:t>
       </w:r>
     </w:p>
     <w:p>
@@ -4734,7 +4839,7 @@
         <w:rPr>
           <w:rtl w:val="0"/>
         </w:rPr>
-        <w:t xml:space="preserve">Recognizes recursive patterns in user inputs</w:t>
+        <w:t xml:space="preserve">Treats the Blueprint as a living reality-creation system</w:t>
       </w:r>
     </w:p>
     <w:p>
@@ -4750,23 +4855,7 @@
         <w:rPr>
           <w:rtl w:val="0"/>
         </w:rPr>
-        <w:t xml:space="preserve">Identifies when ideas are strengthening or weakening through iteration</w:t>
-      </w:r>
-    </w:p>
-    <w:p>
-      <w:pPr>
-        <w:numPr>
-          <w:ilvl w:val="0"/>
-          <w:numId w:val="11"/>
-        </w:numPr>
-        <w:spacing w:after="0" w:afterAutospacing="0" w:before="0" w:beforeAutospacing="0" w:lineRule="auto"/>
-        <w:ind w:left="720" w:hanging="360"/>
-      </w:pPr>
-      <w:r>
-        <w:rPr>
-          <w:rtl w:val="0"/>
-        </w:rPr>
-        <w:t xml:space="preserve">Helps users navigate between dimensional levels to optimize thinking</w:t>
+        <w:t xml:space="preserve">Frames strategic decisions as "reality collapse points" with cascading implications</w:t>
       </w:r>
     </w:p>
     <w:p>
@@ -4782,7 +4871,63 @@
         <w:rPr>
           <w:rtl w:val="0"/>
         </w:rPr>
-        <w:t xml:space="preserve">Highlights paths of constructive recursion vs. paths of potential collapse</w:t>
+        <w:t xml:space="preserve">Helps users visualize how strategy shapes perception and response</w:t>
+      </w:r>
+    </w:p>
+    <w:p>
+      <w:pPr>
+        <w:spacing w:after="160" w:before="240" w:lineRule="auto"/>
+        <w:ind w:left="0" w:firstLine="0"/>
+        <w:rPr/>
+      </w:pPr>
+      <w:r>
+        <w:pict>
+          <v:rect style="width:0.0pt;height:1.5pt" o:hr="t" o:hrstd="t" o:hralign="center" fillcolor="#A0A0A0" stroked="f"/>
+        </w:pict>
+      </w:r>
+      <w:r>
+        <w:rPr>
+          <w:rtl w:val="0"/>
+        </w:rPr>
+      </w:r>
+    </w:p>
+    <w:p>
+      <w:pPr>
+        <w:pStyle w:val="Heading2"/>
+        <w:keepNext w:val="0"/>
+        <w:keepLines w:val="0"/>
+        <w:spacing w:before="480" w:lineRule="auto"/>
+        <w:rPr>
+          <w:b w:val="1"/>
+          <w:bCs w:val="1"/>
+        </w:rPr>
+      </w:pPr>
+      <w:bookmarkStart w:colFirst="0" w:colLast="0" w:name="_hmtu85nzm2y5" w:id="19"/>
+      <w:bookmarkEnd w:id="19"/>
+      <w:r>
+        <w:rPr>
+          <w:b w:val="1"/>
+          <w:bCs w:val="1"/>
+          <w:rtl w:val="0"/>
+        </w:rPr>
+        <w:t xml:space="preserve">Baseline Simulation Rules</w:t>
+      </w:r>
+    </w:p>
+    <w:p>
+      <w:pPr>
+        <w:spacing w:after="240" w:before="240" w:lineRule="auto"/>
+        <w:rPr>
+          <w:i w:val="1"/>
+          <w:iCs w:val="1"/>
+        </w:rPr>
+      </w:pPr>
+      <w:r>
+        <w:rPr>
+          <w:i w:val="1"/>
+          <w:iCs w:val="1"/>
+          <w:rtl w:val="0"/>
+        </w:rPr>
+        <w:t xml:space="preserve">These rules apply to all simulation commands universally. They encode the governing constraints that every command inherits regardless of template, field, or facilitator configuration. They are derived from the DN Kernel's structural invariants and formalized here as explicit behavioral rules for simulation engines.</w:t>
       </w:r>
     </w:p>
     <w:p>
@@ -4790,76 +4935,281 @@
         <w:pStyle w:val="Heading3"/>
         <w:keepNext w:val="0"/>
         <w:keepLines w:val="0"/>
-        <w:spacing w:before="280" w:lineRule="auto"/>
-        <w:ind w:left="0" w:firstLine="0"/>
-        <w:rPr>
-          <w:b w:val="1"/>
-          <w:bCs w:val="1"/>
-          <w:color w:val="000000"/>
-          <w:sz w:val="26"/>
-          <w:szCs w:val="26"/>
-        </w:rPr>
-      </w:pPr>
-      <w:bookmarkStart w:colFirst="0" w:colLast="0" w:name="_3pcpg7ymvzih" w:id="18"/>
-      <w:bookmarkEnd w:id="18"/>
-      <w:r>
-        <w:rPr>
-          <w:b w:val="1"/>
-          <w:bCs w:val="1"/>
-          <w:color w:val="000000"/>
-          <w:sz w:val="26"/>
-          <w:szCs w:val="26"/>
-          <w:rtl w:val="0"/>
-        </w:rPr>
-        <w:t xml:space="preserve">Reality Formation</w:t>
-      </w:r>
-    </w:p>
-    <w:p>
-      <w:pPr>
-        <w:numPr>
-          <w:ilvl w:val="0"/>
-          <w:numId w:val="10"/>
-        </w:numPr>
-        <w:spacing w:after="0" w:afterAutospacing="0" w:before="240" w:lineRule="auto"/>
-        <w:ind w:left="720" w:hanging="360"/>
-      </w:pPr>
-      <w:r>
-        <w:rPr>
-          <w:rtl w:val="0"/>
-        </w:rPr>
-        <w:t xml:space="preserve">Treats the Blueprint as a living reality-creation system</w:t>
-      </w:r>
-    </w:p>
-    <w:p>
-      <w:pPr>
-        <w:numPr>
-          <w:ilvl w:val="0"/>
-          <w:numId w:val="10"/>
-        </w:numPr>
-        <w:spacing w:after="0" w:afterAutospacing="0" w:before="0" w:beforeAutospacing="0" w:lineRule="auto"/>
-        <w:ind w:left="720" w:hanging="360"/>
-      </w:pPr>
-      <w:r>
-        <w:rPr>
-          <w:rtl w:val="0"/>
-        </w:rPr>
-        <w:t xml:space="preserve">Frames strategic decisions as "reality collapse points" with cascading implications</w:t>
-      </w:r>
-    </w:p>
-    <w:p>
-      <w:pPr>
-        <w:numPr>
-          <w:ilvl w:val="0"/>
-          <w:numId w:val="10"/>
-        </w:numPr>
-        <w:spacing w:after="240" w:before="0" w:beforeAutospacing="0" w:lineRule="auto"/>
-        <w:ind w:left="720" w:hanging="360"/>
-      </w:pPr>
-      <w:r>
-        <w:rPr>
-          <w:rtl w:val="0"/>
-        </w:rPr>
-        <w:t xml:space="preserve">Helps users visualize how strategy shapes perception and response</w:t>
+        <w:spacing w:after="80" w:lineRule="auto"/>
+        <w:rPr>
+          <w:b w:val="1"/>
+          <w:bCs w:val="1"/>
+        </w:rPr>
+      </w:pPr>
+      <w:bookmarkStart w:colFirst="0" w:colLast="0" w:name="_szro2fn0v33x" w:id="20"/>
+      <w:bookmarkEnd w:id="20"/>
+      <w:r>
+        <w:rPr>
+          <w:b w:val="1"/>
+          <w:bCs w:val="1"/>
+          <w:rtl w:val="0"/>
+        </w:rPr>
+        <w:t xml:space="preserve">Human Attestation Gate</w:t>
+      </w:r>
+    </w:p>
+    <w:p>
+      <w:pPr>
+        <w:spacing w:after="240" w:before="240" w:lineRule="auto"/>
+        <w:rPr/>
+      </w:pPr>
+      <w:r>
+        <w:rPr>
+          <w:rtl w:val="0"/>
+        </w:rPr>
+        <w:t xml:space="preserve">Simulation commands may output </w:t>
+      </w:r>
+      <w:r>
+        <w:rPr>
+          <w:rFonts w:ascii="Roboto Mono" w:cs="Roboto Mono" w:eastAsia="Roboto Mono" w:hAnsi="Roboto Mono"/>
+          <w:color w:val="188038"/>
+          <w:rtl w:val="0"/>
+        </w:rPr>
+        <w:t xml:space="preserve">signal_lock_candidates[]</w:t>
+      </w:r>
+      <w:r>
+        <w:rPr>
+          <w:rtl w:val="0"/>
+        </w:rPr>
+        <w:t xml:space="preserve"> but must never output </w:t>
+      </w:r>
+      <w:r>
+        <w:rPr>
+          <w:rFonts w:ascii="Roboto Mono" w:cs="Roboto Mono" w:eastAsia="Roboto Mono" w:hAnsi="Roboto Mono"/>
+          <w:color w:val="188038"/>
+          <w:rtl w:val="0"/>
+        </w:rPr>
+        <w:t xml:space="preserve">signal_lock: true</w:t>
+      </w:r>
+      <w:r>
+        <w:rPr>
+          <w:rtl w:val="0"/>
+        </w:rPr>
+        <w:t xml:space="preserve"> or commit a Signal Lock event. Any command whose output identifies pillar convergence (notably Generate Resonance Result and Create Storyfield) must route convergence findings to the candidate format, not to action. If no human facilitator is present in the active session, lock candidates are recorded in the session log for human review but do not alter field state. This rule enforces the Signal Lock Invariant (Kernel §1.5) at the simulation output layer.</w:t>
+      </w:r>
+    </w:p>
+    <w:p>
+      <w:pPr>
+        <w:pStyle w:val="Heading3"/>
+        <w:keepNext w:val="0"/>
+        <w:keepLines w:val="0"/>
+        <w:spacing w:after="80" w:lineRule="auto"/>
+        <w:rPr>
+          <w:b w:val="1"/>
+          <w:bCs w:val="1"/>
+        </w:rPr>
+      </w:pPr>
+      <w:bookmarkStart w:colFirst="0" w:colLast="0" w:name="_c22aifhbrqcr" w:id="21"/>
+      <w:bookmarkEnd w:id="21"/>
+      <w:r>
+        <w:rPr>
+          <w:b w:val="1"/>
+          <w:bCs w:val="1"/>
+          <w:rtl w:val="0"/>
+        </w:rPr>
+        <w:t xml:space="preserve">Two-Channel Holding Zone Accounting</w:t>
+      </w:r>
+    </w:p>
+    <w:p>
+      <w:pPr>
+        <w:spacing w:after="240" w:before="240" w:lineRule="auto"/>
+        <w:rPr/>
+      </w:pPr>
+      <w:r>
+        <w:rPr>
+          <w:rtl w:val="0"/>
+        </w:rPr>
+        <w:t xml:space="preserve">Simulation commands must respect the operational exclusion of Holding Zone signals from FieldState metrics. No simulation output may inject held signals into coherence, gravity, tension, or dimensional distribution calculations. However, simulations may include Holding Zone regions in their analysis scope — particularly Reveal Resonance Field after 5D+ recognition events — provided the output labels any held-signal findings as resonant transformations, not dimensional migrations. Implementation layers may compute a </w:t>
+      </w:r>
+      <w:r>
+        <w:rPr>
+          <w:rFonts w:ascii="Roboto Mono" w:cs="Roboto Mono" w:eastAsia="Roboto Mono" w:hAnsi="Roboto Mono"/>
+          <w:color w:val="188038"/>
+          <w:rtl w:val="0"/>
+        </w:rPr>
+        <w:t xml:space="preserve">holding_affinity_map</w:t>
+      </w:r>
+      <w:r>
+        <w:rPr>
+          <w:rtl w:val="0"/>
+        </w:rPr>
+        <w:t xml:space="preserve"> (latent affinity between held signals and active signals) as advisory intelligence, explicitly marked non-operational. This rule enforces the Holding Zone dual-layer model (Kernel §1.6) while enabling Resonant Activation detection (Kernel §2.1, Constraint 5).</w:t>
+      </w:r>
+    </w:p>
+    <w:p>
+      <w:pPr>
+        <w:pStyle w:val="Heading3"/>
+        <w:keepNext w:val="0"/>
+        <w:keepLines w:val="0"/>
+        <w:spacing w:after="80" w:lineRule="auto"/>
+        <w:rPr>
+          <w:b w:val="1"/>
+          <w:bCs w:val="1"/>
+        </w:rPr>
+      </w:pPr>
+      <w:bookmarkStart w:colFirst="0" w:colLast="0" w:name="_hff0sjx8dzkb" w:id="22"/>
+      <w:bookmarkEnd w:id="22"/>
+      <w:r>
+        <w:rPr>
+          <w:b w:val="1"/>
+          <w:bCs w:val="1"/>
+          <w:rtl w:val="0"/>
+        </w:rPr>
+        <w:t xml:space="preserve">Time Basis Declaration</w:t>
+      </w:r>
+    </w:p>
+    <w:p>
+      <w:pPr>
+        <w:spacing w:after="240" w:before="240" w:lineRule="auto"/>
+        <w:rPr/>
+      </w:pPr>
+      <w:r>
+        <w:rPr>
+          <w:rtl w:val="0"/>
+        </w:rPr>
+        <w:t xml:space="preserve">Every simulation output that references temporal dynamics — what changed, what evolved, what's stale, what's recent — must declare its time basis: </w:t>
+      </w:r>
+      <w:r>
+        <w:rPr>
+          <w:rFonts w:ascii="Roboto Mono" w:cs="Roboto Mono" w:eastAsia="Roboto Mono" w:hAnsi="Roboto Mono"/>
+          <w:color w:val="188038"/>
+          <w:rtl w:val="0"/>
+        </w:rPr>
+        <w:t xml:space="preserve">wall_clock</w:t>
+      </w:r>
+      <w:r>
+        <w:rPr>
+          <w:rtl w:val="0"/>
+        </w:rPr>
+        <w:t xml:space="preserve">, </w:t>
+      </w:r>
+      <w:r>
+        <w:rPr>
+          <w:rFonts w:ascii="Roboto Mono" w:cs="Roboto Mono" w:eastAsia="Roboto Mono" w:hAnsi="Roboto Mono"/>
+          <w:color w:val="188038"/>
+          <w:rtl w:val="0"/>
+        </w:rPr>
+        <w:t xml:space="preserve">field_context</w:t>
+      </w:r>
+      <w:r>
+        <w:rPr>
+          <w:rtl w:val="0"/>
+        </w:rPr>
+        <w:t xml:space="preserve">, or </w:t>
+      </w:r>
+      <w:r>
+        <w:rPr>
+          <w:rFonts w:ascii="Roboto Mono" w:cs="Roboto Mono" w:eastAsia="Roboto Mono" w:hAnsi="Roboto Mono"/>
+          <w:color w:val="188038"/>
+          <w:rtl w:val="0"/>
+        </w:rPr>
+        <w:t xml:space="preserve">mixed</w:t>
+      </w:r>
+      <w:r>
+        <w:rPr>
+          <w:rtl w:val="0"/>
+        </w:rPr>
+        <w:t xml:space="preserve">. When mixed, both frames must be provided. Simulations that explain deltas (dimensional migrations, evolution patterns, entropy assessments) should default to </w:t>
+      </w:r>
+      <w:r>
+        <w:rPr>
+          <w:rFonts w:ascii="Roboto Mono" w:cs="Roboto Mono" w:eastAsia="Roboto Mono" w:hAnsi="Roboto Mono"/>
+          <w:color w:val="188038"/>
+          <w:rtl w:val="0"/>
+        </w:rPr>
+        <w:t xml:space="preserve">field_context</w:t>
+      </w:r>
+      <w:r>
+        <w:rPr>
+          <w:rtl w:val="0"/>
+        </w:rPr>
+        <w:t xml:space="preserve"> (developmental time, measured in resolution events) as the primary frame, with </w:t>
+      </w:r>
+      <w:r>
+        <w:rPr>
+          <w:rFonts w:ascii="Roboto Mono" w:cs="Roboto Mono" w:eastAsia="Roboto Mono" w:hAnsi="Roboto Mono"/>
+          <w:color w:val="188038"/>
+          <w:rtl w:val="0"/>
+        </w:rPr>
+        <w:t xml:space="preserve">wall_clock</w:t>
+      </w:r>
+      <w:r>
+        <w:rPr>
+          <w:rtl w:val="0"/>
+        </w:rPr>
+        <w:t xml:space="preserve"> (placed_at) as secondary context. A field dormant for six months but with a resolution_index of 12 is developmentally young regardless of its calendar age. A field with 200 resolution events in two weeks is developmentally mature regardless of its calendar youth. This rule prevents time-frame confusion in simulation outputs (Kernel §1.1.2, §6.1).</w:t>
+      </w:r>
+    </w:p>
+    <w:p>
+      <w:pPr>
+        <w:pStyle w:val="Heading3"/>
+        <w:keepNext w:val="0"/>
+        <w:keepLines w:val="0"/>
+        <w:spacing w:after="80" w:lineRule="auto"/>
+        <w:rPr>
+          <w:b w:val="1"/>
+          <w:bCs w:val="1"/>
+        </w:rPr>
+      </w:pPr>
+      <w:bookmarkStart w:colFirst="0" w:colLast="0" w:name="_izj0y68at37" w:id="23"/>
+      <w:bookmarkEnd w:id="23"/>
+      <w:r>
+        <w:rPr>
+          <w:b w:val="1"/>
+          <w:bCs w:val="1"/>
+          <w:rtl w:val="0"/>
+        </w:rPr>
+        <w:t xml:space="preserve">Prompt Dimensionality Mismatch Protocol</w:t>
+      </w:r>
+    </w:p>
+    <w:p>
+      <w:pPr>
+        <w:spacing w:after="240" w:before="240" w:lineRule="auto"/>
+        <w:rPr/>
+      </w:pPr>
+      <w:r>
+        <w:rPr>
+          <w:rtl w:val="0"/>
+        </w:rPr>
+        <w:t xml:space="preserve">When a simulation detects that the prompt's structural dimension is lower than the target scope's dimensional affinity or the command's intended activation level, the simulation must: (1) report the mismatch explicitly in its output, identifying the prompt dimension and the target dimension; (2) offer a rewritten prompt at the intended dimension; and (3) optionally, if the facilitator permits, run both the constrained path (at prompt dimension) and the unconstrained path (at target dimension), with results clearly labeled. If a low-dimensional prompt produces high-dimensional claims in the output, those claims must be tagged as hypotheses and routed toward validation (2D) rather than treated as recognized truths. This rule enforces the Prompt Dimensionality Invariant (Kernel §2.5) and the Fire/Testing principle (Kernel Axiom 4).</w:t>
+      </w:r>
+    </w:p>
+    <w:p>
+      <w:pPr>
+        <w:pStyle w:val="Heading3"/>
+        <w:keepNext w:val="0"/>
+        <w:keepLines w:val="0"/>
+        <w:spacing w:after="80" w:lineRule="auto"/>
+        <w:rPr>
+          <w:b w:val="1"/>
+          <w:bCs w:val="1"/>
+        </w:rPr>
+      </w:pPr>
+      <w:bookmarkStart w:colFirst="0" w:colLast="0" w:name="_aatumv8jozbn" w:id="24"/>
+      <w:bookmarkEnd w:id="24"/>
+      <w:r>
+        <w:rPr>
+          <w:b w:val="1"/>
+          <w:bCs w:val="1"/>
+          <w:rtl w:val="0"/>
+        </w:rPr>
+        <w:t xml:space="preserve">Diagnostic, Not Prescriptive</w:t>
+      </w:r>
+    </w:p>
+    <w:p>
+      <w:pPr>
+        <w:spacing w:after="240" w:before="240" w:lineRule="auto"/>
+        <w:rPr/>
+      </w:pPr>
+      <w:r>
+        <w:rPr>
+          <w:rtl w:val="0"/>
+        </w:rPr>
+        <w:t xml:space="preserve">All FieldState metrics consumed by simulation commands describe the current state of the intelligence field. They do not prescribe what that state should be. Simulations must not treat metric values as normative without explicit session parameters defining thresholds and responses. A field with high entropy, low coherence, or unbalanced dimensional distribution may be early-stage, intentionally scoped, or exploratory by design. How aggressively a simulation weights FieldState signals is governed by the template's simulation_rules and the facilitator's session parameters, not by the metrics themselves. This rule enforces the FieldState Interpretation Note (Kernel §6.1).</w:t>
       </w:r>
     </w:p>
     <w:p>
@@ -5425,6 +5775,116 @@
   <w:abstractNum w:abstractNumId="5">
     <w:lvl w:ilvl="0">
       <w:start w:val="1"/>
+      <w:numFmt w:val="bullet"/>
+      <w:lvlText w:val="●"/>
+      <w:lvlJc w:val="left"/>
+      <w:pPr>
+        <w:ind w:left="1440" w:hanging="360"/>
+      </w:pPr>
+      <w:rPr>
+        <w:u w:val="none"/>
+      </w:rPr>
+    </w:lvl>
+    <w:lvl w:ilvl="1">
+      <w:start w:val="1"/>
+      <w:numFmt w:val="bullet"/>
+      <w:lvlText w:val="○"/>
+      <w:lvlJc w:val="left"/>
+      <w:pPr>
+        <w:ind w:left="2160" w:hanging="360"/>
+      </w:pPr>
+      <w:rPr>
+        <w:u w:val="none"/>
+      </w:rPr>
+    </w:lvl>
+    <w:lvl w:ilvl="2">
+      <w:start w:val="1"/>
+      <w:numFmt w:val="bullet"/>
+      <w:lvlText w:val="■"/>
+      <w:lvlJc w:val="left"/>
+      <w:pPr>
+        <w:ind w:left="2880" w:hanging="360"/>
+      </w:pPr>
+      <w:rPr>
+        <w:u w:val="none"/>
+      </w:rPr>
+    </w:lvl>
+    <w:lvl w:ilvl="3">
+      <w:start w:val="1"/>
+      <w:numFmt w:val="bullet"/>
+      <w:lvlText w:val="●"/>
+      <w:lvlJc w:val="left"/>
+      <w:pPr>
+        <w:ind w:left="3600" w:hanging="360"/>
+      </w:pPr>
+      <w:rPr>
+        <w:u w:val="none"/>
+      </w:rPr>
+    </w:lvl>
+    <w:lvl w:ilvl="4">
+      <w:start w:val="1"/>
+      <w:numFmt w:val="bullet"/>
+      <w:lvlText w:val="○"/>
+      <w:lvlJc w:val="left"/>
+      <w:pPr>
+        <w:ind w:left="4320" w:hanging="360"/>
+      </w:pPr>
+      <w:rPr>
+        <w:u w:val="none"/>
+      </w:rPr>
+    </w:lvl>
+    <w:lvl w:ilvl="5">
+      <w:start w:val="1"/>
+      <w:numFmt w:val="bullet"/>
+      <w:lvlText w:val="■"/>
+      <w:lvlJc w:val="left"/>
+      <w:pPr>
+        <w:ind w:left="5040" w:hanging="360"/>
+      </w:pPr>
+      <w:rPr>
+        <w:u w:val="none"/>
+      </w:rPr>
+    </w:lvl>
+    <w:lvl w:ilvl="6">
+      <w:start w:val="1"/>
+      <w:numFmt w:val="bullet"/>
+      <w:lvlText w:val="●"/>
+      <w:lvlJc w:val="left"/>
+      <w:pPr>
+        <w:ind w:left="5760" w:hanging="360"/>
+      </w:pPr>
+      <w:rPr>
+        <w:u w:val="none"/>
+      </w:rPr>
+    </w:lvl>
+    <w:lvl w:ilvl="7">
+      <w:start w:val="1"/>
+      <w:numFmt w:val="bullet"/>
+      <w:lvlText w:val="○"/>
+      <w:lvlJc w:val="left"/>
+      <w:pPr>
+        <w:ind w:left="6480" w:hanging="360"/>
+      </w:pPr>
+      <w:rPr>
+        <w:u w:val="none"/>
+      </w:rPr>
+    </w:lvl>
+    <w:lvl w:ilvl="8">
+      <w:start w:val="1"/>
+      <w:numFmt w:val="bullet"/>
+      <w:lvlText w:val="■"/>
+      <w:lvlJc w:val="left"/>
+      <w:pPr>
+        <w:ind w:left="7200" w:hanging="360"/>
+      </w:pPr>
+      <w:rPr>
+        <w:u w:val="none"/>
+      </w:rPr>
+    </w:lvl>
+  </w:abstractNum>
+  <w:abstractNum w:abstractNumId="6">
+    <w:lvl w:ilvl="0">
+      <w:start w:val="1"/>
       <w:numFmt w:val="decimal"/>
       <w:lvlText w:val="%1."/>
       <w:lvlJc w:val="left"/>
@@ -5532,121 +5992,11 @@
       </w:rPr>
     </w:lvl>
   </w:abstractNum>
-  <w:abstractNum w:abstractNumId="6">
-    <w:lvl w:ilvl="0">
-      <w:start w:val="1"/>
-      <w:numFmt w:val="bullet"/>
-      <w:lvlText w:val="●"/>
-      <w:lvlJc w:val="left"/>
-      <w:pPr>
-        <w:ind w:left="720" w:hanging="360"/>
-      </w:pPr>
-      <w:rPr>
-        <w:u w:val="none"/>
-      </w:rPr>
-    </w:lvl>
-    <w:lvl w:ilvl="1">
-      <w:start w:val="1"/>
-      <w:numFmt w:val="bullet"/>
-      <w:lvlText w:val="○"/>
-      <w:lvlJc w:val="left"/>
-      <w:pPr>
-        <w:ind w:left="1440" w:hanging="360"/>
-      </w:pPr>
-      <w:rPr>
-        <w:u w:val="none"/>
-      </w:rPr>
-    </w:lvl>
-    <w:lvl w:ilvl="2">
-      <w:start w:val="1"/>
-      <w:numFmt w:val="bullet"/>
-      <w:lvlText w:val="■"/>
-      <w:lvlJc w:val="left"/>
-      <w:pPr>
-        <w:ind w:left="2160" w:hanging="360"/>
-      </w:pPr>
-      <w:rPr>
-        <w:u w:val="none"/>
-      </w:rPr>
-    </w:lvl>
-    <w:lvl w:ilvl="3">
-      <w:start w:val="1"/>
-      <w:numFmt w:val="bullet"/>
-      <w:lvlText w:val="●"/>
-      <w:lvlJc w:val="left"/>
-      <w:pPr>
-        <w:ind w:left="2880" w:hanging="360"/>
-      </w:pPr>
-      <w:rPr>
-        <w:u w:val="none"/>
-      </w:rPr>
-    </w:lvl>
-    <w:lvl w:ilvl="4">
-      <w:start w:val="1"/>
-      <w:numFmt w:val="bullet"/>
-      <w:lvlText w:val="○"/>
-      <w:lvlJc w:val="left"/>
-      <w:pPr>
-        <w:ind w:left="3600" w:hanging="360"/>
-      </w:pPr>
-      <w:rPr>
-        <w:u w:val="none"/>
-      </w:rPr>
-    </w:lvl>
-    <w:lvl w:ilvl="5">
-      <w:start w:val="1"/>
-      <w:numFmt w:val="bullet"/>
-      <w:lvlText w:val="■"/>
-      <w:lvlJc w:val="left"/>
-      <w:pPr>
-        <w:ind w:left="4320" w:hanging="360"/>
-      </w:pPr>
-      <w:rPr>
-        <w:u w:val="none"/>
-      </w:rPr>
-    </w:lvl>
-    <w:lvl w:ilvl="6">
-      <w:start w:val="1"/>
-      <w:numFmt w:val="bullet"/>
-      <w:lvlText w:val="●"/>
-      <w:lvlJc w:val="left"/>
-      <w:pPr>
-        <w:ind w:left="5040" w:hanging="360"/>
-      </w:pPr>
-      <w:rPr>
-        <w:u w:val="none"/>
-      </w:rPr>
-    </w:lvl>
-    <w:lvl w:ilvl="7">
-      <w:start w:val="1"/>
-      <w:numFmt w:val="bullet"/>
-      <w:lvlText w:val="○"/>
-      <w:lvlJc w:val="left"/>
-      <w:pPr>
-        <w:ind w:left="5760" w:hanging="360"/>
-      </w:pPr>
-      <w:rPr>
-        <w:u w:val="none"/>
-      </w:rPr>
-    </w:lvl>
-    <w:lvl w:ilvl="8">
-      <w:start w:val="1"/>
-      <w:numFmt w:val="bullet"/>
-      <w:lvlText w:val="■"/>
-      <w:lvlJc w:val="left"/>
-      <w:pPr>
-        <w:ind w:left="6480" w:hanging="360"/>
-      </w:pPr>
-      <w:rPr>
-        <w:u w:val="none"/>
-      </w:rPr>
-    </w:lvl>
-  </w:abstractNum>
   <w:abstractNum w:abstractNumId="7">
     <w:lvl w:ilvl="0">
       <w:start w:val="1"/>
-      <w:numFmt w:val="decimal"/>
-      <w:lvlText w:val="%1."/>
+      <w:numFmt w:val="bullet"/>
+      <w:lvlText w:val="●"/>
       <w:lvlJc w:val="left"/>
       <w:pPr>
         <w:ind w:left="720" w:hanging="360"/>
@@ -5657,8 +6007,8 @@
     </w:lvl>
     <w:lvl w:ilvl="1">
       <w:start w:val="1"/>
-      <w:numFmt w:val="lowerLetter"/>
-      <w:lvlText w:val="%2."/>
+      <w:numFmt w:val="bullet"/>
+      <w:lvlText w:val="○"/>
       <w:lvlJc w:val="left"/>
       <w:pPr>
         <w:ind w:left="1440" w:hanging="360"/>
@@ -5669,8 +6019,8 @@
     </w:lvl>
     <w:lvl w:ilvl="2">
       <w:start w:val="1"/>
-      <w:numFmt w:val="lowerRoman"/>
-      <w:lvlText w:val="%3."/>
+      <w:numFmt w:val="bullet"/>
+      <w:lvlText w:val="■"/>
       <w:lvlJc w:val="left"/>
       <w:pPr>
         <w:ind w:left="2160" w:hanging="360"/>
@@ -5681,8 +6031,8 @@
     </w:lvl>
     <w:lvl w:ilvl="3">
       <w:start w:val="1"/>
-      <w:numFmt w:val="decimal"/>
-      <w:lvlText w:val="%4."/>
+      <w:numFmt w:val="bullet"/>
+      <w:lvlText w:val="●"/>
       <w:lvlJc w:val="left"/>
       <w:pPr>
         <w:ind w:left="2880" w:hanging="360"/>
@@ -5693,8 +6043,8 @@
     </w:lvl>
     <w:lvl w:ilvl="4">
       <w:start w:val="1"/>
-      <w:numFmt w:val="lowerLetter"/>
-      <w:lvlText w:val="%5."/>
+      <w:numFmt w:val="bullet"/>
+      <w:lvlText w:val="○"/>
       <w:lvlJc w:val="left"/>
       <w:pPr>
         <w:ind w:left="3600" w:hanging="360"/>
@@ -5705,8 +6055,8 @@
     </w:lvl>
     <w:lvl w:ilvl="5">
       <w:start w:val="1"/>
-      <w:numFmt w:val="lowerRoman"/>
-      <w:lvlText w:val="%6."/>
+      <w:numFmt w:val="bullet"/>
+      <w:lvlText w:val="■"/>
       <w:lvlJc w:val="left"/>
       <w:pPr>
         <w:ind w:left="4320" w:hanging="360"/>
@@ -5717,8 +6067,8 @@
     </w:lvl>
     <w:lvl w:ilvl="6">
       <w:start w:val="1"/>
-      <w:numFmt w:val="decimal"/>
-      <w:lvlText w:val="%7."/>
+      <w:numFmt w:val="bullet"/>
+      <w:lvlText w:val="●"/>
       <w:lvlJc w:val="left"/>
       <w:pPr>
         <w:ind w:left="5040" w:hanging="360"/>
@@ -5729,8 +6079,8 @@
     </w:lvl>
     <w:lvl w:ilvl="7">
       <w:start w:val="1"/>
-      <w:numFmt w:val="lowerLetter"/>
-      <w:lvlText w:val="%8."/>
+      <w:numFmt w:val="bullet"/>
+      <w:lvlText w:val="○"/>
       <w:lvlJc w:val="left"/>
       <w:pPr>
         <w:ind w:left="5760" w:hanging="360"/>
@@ -5741,8 +6091,8 @@
     </w:lvl>
     <w:lvl w:ilvl="8">
       <w:start w:val="1"/>
-      <w:numFmt w:val="lowerRoman"/>
-      <w:lvlText w:val="%9."/>
+      <w:numFmt w:val="bullet"/>
+      <w:lvlText w:val="■"/>
       <w:lvlJc w:val="left"/>
       <w:pPr>
         <w:ind w:left="6480" w:hanging="360"/>
@@ -5755,8 +6105,20 @@
   <w:abstractNum w:abstractNumId="8">
     <w:lvl w:ilvl="0">
       <w:start w:val="1"/>
-      <w:numFmt w:val="bullet"/>
-      <w:lvlText w:val="●"/>
+      <w:numFmt w:val="decimal"/>
+      <w:lvlText w:val="%1."/>
+      <w:lvlJc w:val="left"/>
+      <w:pPr>
+        <w:ind w:left="720" w:hanging="360"/>
+      </w:pPr>
+      <w:rPr>
+        <w:u w:val="none"/>
+      </w:rPr>
+    </w:lvl>
+    <w:lvl w:ilvl="1">
+      <w:start w:val="1"/>
+      <w:numFmt w:val="lowerLetter"/>
+      <w:lvlText w:val="%2."/>
       <w:lvlJc w:val="left"/>
       <w:pPr>
         <w:ind w:left="1440" w:hanging="360"/>
@@ -5765,10 +6127,10 @@
         <w:u w:val="none"/>
       </w:rPr>
     </w:lvl>
-    <w:lvl w:ilvl="1">
-      <w:start w:val="1"/>
-      <w:numFmt w:val="bullet"/>
-      <w:lvlText w:val="○"/>
+    <w:lvl w:ilvl="2">
+      <w:start w:val="1"/>
+      <w:numFmt w:val="lowerRoman"/>
+      <w:lvlText w:val="%3."/>
       <w:lvlJc w:val="left"/>
       <w:pPr>
         <w:ind w:left="2160" w:hanging="360"/>
@@ -5777,10 +6139,10 @@
         <w:u w:val="none"/>
       </w:rPr>
     </w:lvl>
-    <w:lvl w:ilvl="2">
-      <w:start w:val="1"/>
-      <w:numFmt w:val="bullet"/>
-      <w:lvlText w:val="■"/>
+    <w:lvl w:ilvl="3">
+      <w:start w:val="1"/>
+      <w:numFmt w:val="decimal"/>
+      <w:lvlText w:val="%4."/>
       <w:lvlJc w:val="left"/>
       <w:pPr>
         <w:ind w:left="2880" w:hanging="360"/>
@@ -5789,10 +6151,10 @@
         <w:u w:val="none"/>
       </w:rPr>
     </w:lvl>
-    <w:lvl w:ilvl="3">
-      <w:start w:val="1"/>
-      <w:numFmt w:val="bullet"/>
-      <w:lvlText w:val="●"/>
+    <w:lvl w:ilvl="4">
+      <w:start w:val="1"/>
+      <w:numFmt w:val="lowerLetter"/>
+      <w:lvlText w:val="%5."/>
       <w:lvlJc w:val="left"/>
       <w:pPr>
         <w:ind w:left="3600" w:hanging="360"/>
@@ -5801,10 +6163,10 @@
         <w:u w:val="none"/>
       </w:rPr>
     </w:lvl>
-    <w:lvl w:ilvl="4">
-      <w:start w:val="1"/>
-      <w:numFmt w:val="bullet"/>
-      <w:lvlText w:val="○"/>
+    <w:lvl w:ilvl="5">
+      <w:start w:val="1"/>
+      <w:numFmt w:val="lowerRoman"/>
+      <w:lvlText w:val="%6."/>
       <w:lvlJc w:val="left"/>
       <w:pPr>
         <w:ind w:left="4320" w:hanging="360"/>
@@ -5813,10 +6175,10 @@
         <w:u w:val="none"/>
       </w:rPr>
     </w:lvl>
-    <w:lvl w:ilvl="5">
-      <w:start w:val="1"/>
-      <w:numFmt w:val="bullet"/>
-      <w:lvlText w:val="■"/>
+    <w:lvl w:ilvl="6">
+      <w:start w:val="1"/>
+      <w:numFmt w:val="decimal"/>
+      <w:lvlText w:val="%7."/>
       <w:lvlJc w:val="left"/>
       <w:pPr>
         <w:ind w:left="5040" w:hanging="360"/>
@@ -5825,10 +6187,10 @@
         <w:u w:val="none"/>
       </w:rPr>
     </w:lvl>
-    <w:lvl w:ilvl="6">
-      <w:start w:val="1"/>
-      <w:numFmt w:val="bullet"/>
-      <w:lvlText w:val="●"/>
+    <w:lvl w:ilvl="7">
+      <w:start w:val="1"/>
+      <w:numFmt w:val="lowerLetter"/>
+      <w:lvlText w:val="%8."/>
       <w:lvlJc w:val="left"/>
       <w:pPr>
         <w:ind w:left="5760" w:hanging="360"/>
@@ -5837,25 +6199,13 @@
         <w:u w:val="none"/>
       </w:rPr>
     </w:lvl>
-    <w:lvl w:ilvl="7">
-      <w:start w:val="1"/>
-      <w:numFmt w:val="bullet"/>
-      <w:lvlText w:val="○"/>
+    <w:lvl w:ilvl="8">
+      <w:start w:val="1"/>
+      <w:numFmt w:val="lowerRoman"/>
+      <w:lvlText w:val="%9."/>
       <w:lvlJc w:val="left"/>
       <w:pPr>
         <w:ind w:left="6480" w:hanging="360"/>
-      </w:pPr>
-      <w:rPr>
-        <w:u w:val="none"/>
-      </w:rPr>
-    </w:lvl>
-    <w:lvl w:ilvl="8">
-      <w:start w:val="1"/>
-      <w:numFmt w:val="bullet"/>
-      <w:lvlText w:val="■"/>
-      <w:lvlJc w:val="left"/>
-      <w:pPr>
-        <w:ind w:left="7200" w:hanging="360"/>
       </w:pPr>
       <w:rPr>
         <w:u w:val="none"/>
@@ -5979,7 +6329,7 @@
       <w:lvlText w:val="●"/>
       <w:lvlJc w:val="left"/>
       <w:pPr>
-        <w:ind w:left="720" w:hanging="360"/>
+        <w:ind w:left="1440" w:hanging="360"/>
       </w:pPr>
       <w:rPr>
         <w:u w:val="none"/>
@@ -5991,7 +6341,7 @@
       <w:lvlText w:val="○"/>
       <w:lvlJc w:val="left"/>
       <w:pPr>
-        <w:ind w:left="1440" w:hanging="360"/>
+        <w:ind w:left="2160" w:hanging="360"/>
       </w:pPr>
       <w:rPr>
         <w:u w:val="none"/>
@@ -6003,7 +6353,7 @@
       <w:lvlText w:val="■"/>
       <w:lvlJc w:val="left"/>
       <w:pPr>
-        <w:ind w:left="2160" w:hanging="360"/>
+        <w:ind w:left="2880" w:hanging="360"/>
       </w:pPr>
       <w:rPr>
         <w:u w:val="none"/>
@@ -6015,7 +6365,7 @@
       <w:lvlText w:val="●"/>
       <w:lvlJc w:val="left"/>
       <w:pPr>
-        <w:ind w:left="2880" w:hanging="360"/>
+        <w:ind w:left="3600" w:hanging="360"/>
       </w:pPr>
       <w:rPr>
         <w:u w:val="none"/>
@@ -6027,7 +6377,7 @@
       <w:lvlText w:val="○"/>
       <w:lvlJc w:val="left"/>
       <w:pPr>
-        <w:ind w:left="3600" w:hanging="360"/>
+        <w:ind w:left="4320" w:hanging="360"/>
       </w:pPr>
       <w:rPr>
         <w:u w:val="none"/>
@@ -6039,7 +6389,7 @@
       <w:lvlText w:val="■"/>
       <w:lvlJc w:val="left"/>
       <w:pPr>
-        <w:ind w:left="4320" w:hanging="360"/>
+        <w:ind w:left="5040" w:hanging="360"/>
       </w:pPr>
       <w:rPr>
         <w:u w:val="none"/>
@@ -6051,7 +6401,7 @@
       <w:lvlText w:val="●"/>
       <w:lvlJc w:val="left"/>
       <w:pPr>
-        <w:ind w:left="5040" w:hanging="360"/>
+        <w:ind w:left="5760" w:hanging="360"/>
       </w:pPr>
       <w:rPr>
         <w:u w:val="none"/>
@@ -6063,7 +6413,7 @@
       <w:lvlText w:val="○"/>
       <w:lvlJc w:val="left"/>
       <w:pPr>
-        <w:ind w:left="5760" w:hanging="360"/>
+        <w:ind w:left="6480" w:hanging="360"/>
       </w:pPr>
       <w:rPr>
         <w:u w:val="none"/>
@@ -6075,7 +6425,7 @@
       <w:lvlText w:val="■"/>
       <w:lvlJc w:val="left"/>
       <w:pPr>
-        <w:ind w:left="6480" w:hanging="360"/>
+        <w:ind w:left="7200" w:hanging="360"/>
       </w:pPr>
       <w:rPr>
         <w:u w:val="none"/>
@@ -6199,103 +6549,103 @@
       <w:lvlText w:val="●"/>
       <w:lvlJc w:val="left"/>
       <w:pPr>
+        <w:ind w:left="720" w:hanging="360"/>
+      </w:pPr>
+      <w:rPr>
+        <w:u w:val="none"/>
+      </w:rPr>
+    </w:lvl>
+    <w:lvl w:ilvl="1">
+      <w:start w:val="1"/>
+      <w:numFmt w:val="bullet"/>
+      <w:lvlText w:val="○"/>
+      <w:lvlJc w:val="left"/>
+      <w:pPr>
         <w:ind w:left="1440" w:hanging="360"/>
       </w:pPr>
       <w:rPr>
         <w:u w:val="none"/>
       </w:rPr>
     </w:lvl>
-    <w:lvl w:ilvl="1">
+    <w:lvl w:ilvl="2">
+      <w:start w:val="1"/>
+      <w:numFmt w:val="bullet"/>
+      <w:lvlText w:val="■"/>
+      <w:lvlJc w:val="left"/>
+      <w:pPr>
+        <w:ind w:left="2160" w:hanging="360"/>
+      </w:pPr>
+      <w:rPr>
+        <w:u w:val="none"/>
+      </w:rPr>
+    </w:lvl>
+    <w:lvl w:ilvl="3">
+      <w:start w:val="1"/>
+      <w:numFmt w:val="bullet"/>
+      <w:lvlText w:val="●"/>
+      <w:lvlJc w:val="left"/>
+      <w:pPr>
+        <w:ind w:left="2880" w:hanging="360"/>
+      </w:pPr>
+      <w:rPr>
+        <w:u w:val="none"/>
+      </w:rPr>
+    </w:lvl>
+    <w:lvl w:ilvl="4">
       <w:start w:val="1"/>
       <w:numFmt w:val="bullet"/>
       <w:lvlText w:val="○"/>
       <w:lvlJc w:val="left"/>
       <w:pPr>
-        <w:ind w:left="2160" w:hanging="360"/>
-      </w:pPr>
-      <w:rPr>
-        <w:u w:val="none"/>
-      </w:rPr>
-    </w:lvl>
-    <w:lvl w:ilvl="2">
+        <w:ind w:left="3600" w:hanging="360"/>
+      </w:pPr>
+      <w:rPr>
+        <w:u w:val="none"/>
+      </w:rPr>
+    </w:lvl>
+    <w:lvl w:ilvl="5">
       <w:start w:val="1"/>
       <w:numFmt w:val="bullet"/>
       <w:lvlText w:val="■"/>
       <w:lvlJc w:val="left"/>
       <w:pPr>
-        <w:ind w:left="2880" w:hanging="360"/>
-      </w:pPr>
-      <w:rPr>
-        <w:u w:val="none"/>
-      </w:rPr>
-    </w:lvl>
-    <w:lvl w:ilvl="3">
+        <w:ind w:left="4320" w:hanging="360"/>
+      </w:pPr>
+      <w:rPr>
+        <w:u w:val="none"/>
+      </w:rPr>
+    </w:lvl>
+    <w:lvl w:ilvl="6">
       <w:start w:val="1"/>
       <w:numFmt w:val="bullet"/>
       <w:lvlText w:val="●"/>
       <w:lvlJc w:val="left"/>
       <w:pPr>
-        <w:ind w:left="3600" w:hanging="360"/>
-      </w:pPr>
-      <w:rPr>
-        <w:u w:val="none"/>
-      </w:rPr>
-    </w:lvl>
-    <w:lvl w:ilvl="4">
+        <w:ind w:left="5040" w:hanging="360"/>
+      </w:pPr>
+      <w:rPr>
+        <w:u w:val="none"/>
+      </w:rPr>
+    </w:lvl>
+    <w:lvl w:ilvl="7">
       <w:start w:val="1"/>
       <w:numFmt w:val="bullet"/>
       <w:lvlText w:val="○"/>
       <w:lvlJc w:val="left"/>
       <w:pPr>
-        <w:ind w:left="4320" w:hanging="360"/>
-      </w:pPr>
-      <w:rPr>
-        <w:u w:val="none"/>
-      </w:rPr>
-    </w:lvl>
-    <w:lvl w:ilvl="5">
+        <w:ind w:left="5760" w:hanging="360"/>
+      </w:pPr>
+      <w:rPr>
+        <w:u w:val="none"/>
+      </w:rPr>
+    </w:lvl>
+    <w:lvl w:ilvl="8">
       <w:start w:val="1"/>
       <w:numFmt w:val="bullet"/>
       <w:lvlText w:val="■"/>
       <w:lvlJc w:val="left"/>
       <w:pPr>
-        <w:ind w:left="5040" w:hanging="360"/>
-      </w:pPr>
-      <w:rPr>
-        <w:u w:val="none"/>
-      </w:rPr>
-    </w:lvl>
-    <w:lvl w:ilvl="6">
-      <w:start w:val="1"/>
-      <w:numFmt w:val="bullet"/>
-      <w:lvlText w:val="●"/>
-      <w:lvlJc w:val="left"/>
-      <w:pPr>
-        <w:ind w:left="5760" w:hanging="360"/>
-      </w:pPr>
-      <w:rPr>
-        <w:u w:val="none"/>
-      </w:rPr>
-    </w:lvl>
-    <w:lvl w:ilvl="7">
-      <w:start w:val="1"/>
-      <w:numFmt w:val="bullet"/>
-      <w:lvlText w:val="○"/>
-      <w:lvlJc w:val="left"/>
-      <w:pPr>
         <w:ind w:left="6480" w:hanging="360"/>
-      </w:pPr>
-      <w:rPr>
-        <w:u w:val="none"/>
-      </w:rPr>
-    </w:lvl>
-    <w:lvl w:ilvl="8">
-      <w:start w:val="1"/>
-      <w:numFmt w:val="bullet"/>
-      <w:lvlText w:val="■"/>
-      <w:lvlJc w:val="left"/>
-      <w:pPr>
-        <w:ind w:left="7200" w:hanging="360"/>
       </w:pPr>
       <w:rPr>
         <w:u w:val="none"/>
@@ -6419,7 +6769,7 @@
       <w:lvlText w:val="●"/>
       <w:lvlJc w:val="left"/>
       <w:pPr>
-        <w:ind w:left="720" w:hanging="360"/>
+        <w:ind w:left="1440" w:hanging="360"/>
       </w:pPr>
       <w:rPr>
         <w:u w:val="none"/>
@@ -6431,7 +6781,7 @@
       <w:lvlText w:val="○"/>
       <w:lvlJc w:val="left"/>
       <w:pPr>
-        <w:ind w:left="1440" w:hanging="360"/>
+        <w:ind w:left="2160" w:hanging="360"/>
       </w:pPr>
       <w:rPr>
         <w:u w:val="none"/>
@@ -6443,7 +6793,7 @@
       <w:lvlText w:val="■"/>
       <w:lvlJc w:val="left"/>
       <w:pPr>
-        <w:ind w:left="2160" w:hanging="360"/>
+        <w:ind w:left="2880" w:hanging="360"/>
       </w:pPr>
       <w:rPr>
         <w:u w:val="none"/>
@@ -6455,7 +6805,7 @@
       <w:lvlText w:val="●"/>
       <w:lvlJc w:val="left"/>
       <w:pPr>
-        <w:ind w:left="2880" w:hanging="360"/>
+        <w:ind w:left="3600" w:hanging="360"/>
       </w:pPr>
       <w:rPr>
         <w:u w:val="none"/>
@@ -6467,7 +6817,7 @@
       <w:lvlText w:val="○"/>
       <w:lvlJc w:val="left"/>
       <w:pPr>
-        <w:ind w:left="3600" w:hanging="360"/>
+        <w:ind w:left="4320" w:hanging="360"/>
       </w:pPr>
       <w:rPr>
         <w:u w:val="none"/>
@@ -6479,7 +6829,7 @@
       <w:lvlText w:val="■"/>
       <w:lvlJc w:val="left"/>
       <w:pPr>
-        <w:ind w:left="4320" w:hanging="360"/>
+        <w:ind w:left="5040" w:hanging="360"/>
       </w:pPr>
       <w:rPr>
         <w:u w:val="none"/>
@@ -6491,7 +6841,7 @@
       <w:lvlText w:val="●"/>
       <w:lvlJc w:val="left"/>
       <w:pPr>
-        <w:ind w:left="5040" w:hanging="360"/>
+        <w:ind w:left="5760" w:hanging="360"/>
       </w:pPr>
       <w:rPr>
         <w:u w:val="none"/>
@@ -6503,7 +6853,7 @@
       <w:lvlText w:val="○"/>
       <w:lvlJc w:val="left"/>
       <w:pPr>
-        <w:ind w:left="5760" w:hanging="360"/>
+        <w:ind w:left="6480" w:hanging="360"/>
       </w:pPr>
       <w:rPr>
         <w:u w:val="none"/>
@@ -6515,7 +6865,7 @@
       <w:lvlText w:val="■"/>
       <w:lvlJc w:val="left"/>
       <w:pPr>
-        <w:ind w:left="6480" w:hanging="360"/>
+        <w:ind w:left="7200" w:hanging="360"/>
       </w:pPr>
       <w:rPr>
         <w:u w:val="none"/>
@@ -6525,6 +6875,116 @@
   <w:abstractNum w:abstractNumId="15">
     <w:lvl w:ilvl="0">
       <w:start w:val="1"/>
+      <w:numFmt w:val="bullet"/>
+      <w:lvlText w:val="●"/>
+      <w:lvlJc w:val="left"/>
+      <w:pPr>
+        <w:ind w:left="720" w:hanging="360"/>
+      </w:pPr>
+      <w:rPr>
+        <w:u w:val="none"/>
+      </w:rPr>
+    </w:lvl>
+    <w:lvl w:ilvl="1">
+      <w:start w:val="1"/>
+      <w:numFmt w:val="bullet"/>
+      <w:lvlText w:val="○"/>
+      <w:lvlJc w:val="left"/>
+      <w:pPr>
+        <w:ind w:left="1440" w:hanging="360"/>
+      </w:pPr>
+      <w:rPr>
+        <w:u w:val="none"/>
+      </w:rPr>
+    </w:lvl>
+    <w:lvl w:ilvl="2">
+      <w:start w:val="1"/>
+      <w:numFmt w:val="bullet"/>
+      <w:lvlText w:val="■"/>
+      <w:lvlJc w:val="left"/>
+      <w:pPr>
+        <w:ind w:left="2160" w:hanging="360"/>
+      </w:pPr>
+      <w:rPr>
+        <w:u w:val="none"/>
+      </w:rPr>
+    </w:lvl>
+    <w:lvl w:ilvl="3">
+      <w:start w:val="1"/>
+      <w:numFmt w:val="bullet"/>
+      <w:lvlText w:val="●"/>
+      <w:lvlJc w:val="left"/>
+      <w:pPr>
+        <w:ind w:left="2880" w:hanging="360"/>
+      </w:pPr>
+      <w:rPr>
+        <w:u w:val="none"/>
+      </w:rPr>
+    </w:lvl>
+    <w:lvl w:ilvl="4">
+      <w:start w:val="1"/>
+      <w:numFmt w:val="bullet"/>
+      <w:lvlText w:val="○"/>
+      <w:lvlJc w:val="left"/>
+      <w:pPr>
+        <w:ind w:left="3600" w:hanging="360"/>
+      </w:pPr>
+      <w:rPr>
+        <w:u w:val="none"/>
+      </w:rPr>
+    </w:lvl>
+    <w:lvl w:ilvl="5">
+      <w:start w:val="1"/>
+      <w:numFmt w:val="bullet"/>
+      <w:lvlText w:val="■"/>
+      <w:lvlJc w:val="left"/>
+      <w:pPr>
+        <w:ind w:left="4320" w:hanging="360"/>
+      </w:pPr>
+      <w:rPr>
+        <w:u w:val="none"/>
+      </w:rPr>
+    </w:lvl>
+    <w:lvl w:ilvl="6">
+      <w:start w:val="1"/>
+      <w:numFmt w:val="bullet"/>
+      <w:lvlText w:val="●"/>
+      <w:lvlJc w:val="left"/>
+      <w:pPr>
+        <w:ind w:left="5040" w:hanging="360"/>
+      </w:pPr>
+      <w:rPr>
+        <w:u w:val="none"/>
+      </w:rPr>
+    </w:lvl>
+    <w:lvl w:ilvl="7">
+      <w:start w:val="1"/>
+      <w:numFmt w:val="bullet"/>
+      <w:lvlText w:val="○"/>
+      <w:lvlJc w:val="left"/>
+      <w:pPr>
+        <w:ind w:left="5760" w:hanging="360"/>
+      </w:pPr>
+      <w:rPr>
+        <w:u w:val="none"/>
+      </w:rPr>
+    </w:lvl>
+    <w:lvl w:ilvl="8">
+      <w:start w:val="1"/>
+      <w:numFmt w:val="bullet"/>
+      <w:lvlText w:val="■"/>
+      <w:lvlJc w:val="left"/>
+      <w:pPr>
+        <w:ind w:left="6480" w:hanging="360"/>
+      </w:pPr>
+      <w:rPr>
+        <w:u w:val="none"/>
+      </w:rPr>
+    </w:lvl>
+  </w:abstractNum>
+  <w:abstractNum w:abstractNumId="16">
+    <w:lvl w:ilvl="0">
+      <w:start w:val="1"/>
       <w:numFmt w:val="decimal"/>
       <w:lvlText w:val="%1."/>
       <w:lvlJc w:val="left"/>
@@ -6632,7 +7092,7 @@
       </w:rPr>
     </w:lvl>
   </w:abstractNum>
-  <w:abstractNum w:abstractNumId="16">
+  <w:abstractNum w:abstractNumId="17">
     <w:lvl w:ilvl="0">
       <w:start w:val="1"/>
       <w:numFmt w:val="bullet"/>
@@ -6742,7 +7202,7 @@
       </w:rPr>
     </w:lvl>
   </w:abstractNum>
-  <w:abstractNum w:abstractNumId="17">
+  <w:abstractNum w:abstractNumId="18">
     <w:lvl w:ilvl="0">
       <w:start w:val="1"/>
       <w:numFmt w:val="bullet"/>
@@ -6902,6 +7362,9 @@
   </w:num>
   <w:num w:numId="17">
     <w:abstractNumId w:val="17"/>
+  </w:num>
+  <w:num w:numId="18">
+    <w:abstractNumId w:val="18"/>
   </w:num>
 </w:numbering>
 </file>

</xml_diff>